<commit_message>
Stable baseline before hybrid explainability upgrades
</commit_message>
<xml_diff>
--- a/Install imbalanced-learn.docx
+++ b/Install imbalanced-learn.docx
@@ -334,7 +334,6 @@
         <w:t xml:space="preserve">from </w:t>
       </w:r>
       <w:proofErr w:type="spellStart"/>
-      <w:proofErr w:type="gramStart"/>
       <w:r>
         <w:rPr>
           <w:rFonts w:ascii="Times New Roman" w:hAnsi="Times New Roman" w:cs="Times New Roman"/>
@@ -344,7 +343,6 @@
         <w:t>sklearn.ensemble</w:t>
       </w:r>
       <w:proofErr w:type="spellEnd"/>
-      <w:proofErr w:type="gramEnd"/>
       <w:r>
         <w:rPr>
           <w:rFonts w:ascii="Times New Roman" w:hAnsi="Times New Roman" w:cs="Times New Roman"/>
@@ -402,7 +400,6 @@
         <w:t xml:space="preserve">from </w:t>
       </w:r>
       <w:proofErr w:type="spellStart"/>
-      <w:proofErr w:type="gramStart"/>
       <w:r>
         <w:rPr>
           <w:rFonts w:ascii="Times New Roman" w:hAnsi="Times New Roman" w:cs="Times New Roman"/>
@@ -412,7 +409,6 @@
         <w:t>imblearn.ensemble</w:t>
       </w:r>
       <w:proofErr w:type="spellEnd"/>
-      <w:proofErr w:type="gramEnd"/>
       <w:r>
         <w:rPr>
           <w:rFonts w:ascii="Times New Roman" w:hAnsi="Times New Roman" w:cs="Times New Roman"/>
@@ -529,7 +525,6 @@
         <w:t xml:space="preserve">model = </w:t>
       </w:r>
       <w:proofErr w:type="spellStart"/>
-      <w:proofErr w:type="gramStart"/>
       <w:r>
         <w:rPr>
           <w:rFonts w:ascii="Times New Roman" w:hAnsi="Times New Roman" w:cs="Times New Roman"/>
@@ -547,7 +542,6 @@
         </w:rPr>
         <w:t>(</w:t>
       </w:r>
-      <w:proofErr w:type="gramEnd"/>
     </w:p>
     <w:p>
       <w:pPr>
@@ -620,6 +614,7 @@
           <w:sz w:val="24"/>
           <w:szCs w:val="24"/>
         </w:rPr>
+        <w:lastRenderedPageBreak/>
         <w:t># --------------------------------------------------------</w:t>
       </w:r>
       <w:r>
@@ -638,14 +633,6 @@
           <w:szCs w:val="24"/>
         </w:rPr>
         <w:br/>
-      </w:r>
-      <w:r>
-        <w:rPr>
-          <w:rFonts w:ascii="Times New Roman" w:hAnsi="Times New Roman" w:cs="Times New Roman"/>
-          <w:sz w:val="24"/>
-          <w:szCs w:val="24"/>
-        </w:rPr>
-        <w:lastRenderedPageBreak/>
         <w:t># --------------------------------------------------------</w:t>
       </w:r>
       <w:r>
@@ -908,58 +895,30 @@
           <w:szCs w:val="24"/>
         </w:rPr>
       </w:pPr>
-      <w:proofErr w:type="gramStart"/>
-      <w:r>
-        <w:rPr>
-          <w:rFonts w:ascii="Times New Roman" w:hAnsi="Times New Roman" w:cs="Times New Roman"/>
-          <w:sz w:val="24"/>
-          <w:szCs w:val="24"/>
-        </w:rPr>
-        <w:t>So</w:t>
-      </w:r>
-      <w:proofErr w:type="gramEnd"/>
-      <w:r>
-        <w:rPr>
-          <w:rFonts w:ascii="Times New Roman" w:hAnsi="Times New Roman" w:cs="Times New Roman"/>
-          <w:sz w:val="24"/>
-          <w:szCs w:val="24"/>
-        </w:rPr>
-        <w:t xml:space="preserve"> the model naturally learns:</w:t>
-      </w:r>
-    </w:p>
-    <w:p>
-      <w:pPr>
-        <w:rPr>
-          <w:rFonts w:ascii="Times New Roman" w:hAnsi="Times New Roman" w:cs="Times New Roman"/>
-          <w:sz w:val="24"/>
-          <w:szCs w:val="24"/>
-        </w:rPr>
-      </w:pPr>
-      <w:r>
-        <w:rPr>
-          <w:rFonts w:ascii="Times New Roman" w:hAnsi="Times New Roman" w:cs="Times New Roman"/>
-          <w:sz w:val="24"/>
-          <w:szCs w:val="24"/>
-        </w:rPr>
-        <w:t>“</w:t>
-      </w:r>
-      <w:proofErr w:type="gramStart"/>
-      <w:r>
-        <w:rPr>
-          <w:rFonts w:ascii="Times New Roman" w:hAnsi="Times New Roman" w:cs="Times New Roman"/>
-          <w:sz w:val="24"/>
-          <w:szCs w:val="24"/>
-        </w:rPr>
-        <w:t>predicting</w:t>
-      </w:r>
-      <w:proofErr w:type="gramEnd"/>
-      <w:r>
-        <w:rPr>
-          <w:rFonts w:ascii="Times New Roman" w:hAnsi="Times New Roman" w:cs="Times New Roman"/>
-          <w:sz w:val="24"/>
-          <w:szCs w:val="24"/>
-        </w:rPr>
-        <w:t xml:space="preserve"> non-severe is safer statistically.”</w:t>
+      <w:r>
+        <w:rPr>
+          <w:rFonts w:ascii="Times New Roman" w:hAnsi="Times New Roman" w:cs="Times New Roman"/>
+          <w:sz w:val="24"/>
+          <w:szCs w:val="24"/>
+        </w:rPr>
+        <w:t>So the model naturally learns:</w:t>
+      </w:r>
+    </w:p>
+    <w:p>
+      <w:pPr>
+        <w:rPr>
+          <w:rFonts w:ascii="Times New Roman" w:hAnsi="Times New Roman" w:cs="Times New Roman"/>
+          <w:sz w:val="24"/>
+          <w:szCs w:val="24"/>
+        </w:rPr>
+      </w:pPr>
+      <w:r>
+        <w:rPr>
+          <w:rFonts w:ascii="Times New Roman" w:hAnsi="Times New Roman" w:cs="Times New Roman"/>
+          <w:sz w:val="24"/>
+          <w:szCs w:val="24"/>
+        </w:rPr>
+        <w:t>“predicting non-severe is safer statistically.”</w:t>
       </w:r>
     </w:p>
     <w:p>
@@ -1225,6 +1184,7 @@
           <w:sz w:val="24"/>
           <w:szCs w:val="24"/>
         </w:rPr>
+        <w:lastRenderedPageBreak/>
         <w:t>Accuracy</w:t>
       </w:r>
       <w:r>
@@ -1252,14 +1212,6 @@
           <w:szCs w:val="24"/>
         </w:rPr>
         <w:br/>
-      </w:r>
-      <w:r>
-        <w:rPr>
-          <w:rFonts w:ascii="Times New Roman" w:hAnsi="Times New Roman" w:cs="Times New Roman"/>
-          <w:sz w:val="24"/>
-          <w:szCs w:val="24"/>
-        </w:rPr>
-        <w:lastRenderedPageBreak/>
         <w:t>Classification Report</w:t>
       </w:r>
       <w:r>
@@ -1729,7 +1681,6 @@
         </w:rPr>
       </w:pPr>
       <w:proofErr w:type="spellStart"/>
-      <w:proofErr w:type="gramStart"/>
       <w:r>
         <w:rPr>
           <w:rFonts w:ascii="Times New Roman" w:hAnsi="Times New Roman" w:cs="Times New Roman"/>
@@ -1739,7 +1690,6 @@
         <w:t>joblib.dump</w:t>
       </w:r>
       <w:proofErr w:type="spellEnd"/>
-      <w:proofErr w:type="gramEnd"/>
       <w:r>
         <w:rPr>
           <w:rFonts w:ascii="Times New Roman" w:hAnsi="Times New Roman" w:cs="Times New Roman"/>
@@ -1757,7 +1707,6 @@
         <w:br/>
       </w:r>
       <w:proofErr w:type="spellStart"/>
-      <w:proofErr w:type="gramStart"/>
       <w:r>
         <w:rPr>
           <w:rFonts w:ascii="Times New Roman" w:hAnsi="Times New Roman" w:cs="Times New Roman"/>
@@ -1767,7 +1716,6 @@
         <w:t>joblib.dump</w:t>
       </w:r>
       <w:proofErr w:type="spellEnd"/>
-      <w:proofErr w:type="gramEnd"/>
       <w:r>
         <w:rPr>
           <w:rFonts w:ascii="Times New Roman" w:hAnsi="Times New Roman" w:cs="Times New Roman"/>
@@ -2003,6 +1951,14 @@
           <w:szCs w:val="24"/>
         </w:rPr>
         <w:br/>
+      </w:r>
+      <w:r>
+        <w:rPr>
+          <w:rFonts w:ascii="Times New Roman" w:hAnsi="Times New Roman" w:cs="Times New Roman"/>
+          <w:sz w:val="24"/>
+          <w:szCs w:val="24"/>
+        </w:rPr>
+        <w:lastRenderedPageBreak/>
         <w:t>-Body '{"age":25,"sex":0,"fever":0,"cold":0,"rigor":0,"fatigue":0,"headace":0,"bitter_tongue":0,"vomitting":0,"diarrhea":0,"Convulsion":0,"Anemia":0,"jundice":0,"cocacola_urine":0,"hypoglycemia":0,"prostraction":0,"hyperpyrexia":0}'</w:t>
       </w:r>
     </w:p>
@@ -2020,7 +1976,6 @@
           <w:sz w:val="24"/>
           <w:szCs w:val="24"/>
         </w:rPr>
-        <w:lastRenderedPageBreak/>
         <w:pict w14:anchorId="0C840804">
           <v:rect id="_x0000_i1038" style="width:0;height:1.5pt" o:hralign="center" o:hrstd="t" o:hr="t" fillcolor="#a0a0a0" stroked="f"/>
         </w:pict>
@@ -2625,6 +2580,7 @@
           <w:sz w:val="24"/>
           <w:szCs w:val="24"/>
         </w:rPr>
+        <w:lastRenderedPageBreak/>
         <w:t>Which will include:</w:t>
       </w:r>
     </w:p>
@@ -2785,7 +2741,6 @@
                 <w:sz w:val="24"/>
                 <w:szCs w:val="24"/>
               </w:rPr>
-              <w:lastRenderedPageBreak/>
               <w:t>Local explanations</w:t>
             </w:r>
           </w:p>
@@ -3393,6 +3348,7 @@
           <w:sz w:val="24"/>
           <w:szCs w:val="24"/>
         </w:rPr>
+        <w:lastRenderedPageBreak/>
         <w:t xml:space="preserve">HOW XAI exposed instability </w:t>
       </w:r>
     </w:p>
@@ -3461,7 +3417,6 @@
           <w:sz w:val="24"/>
           <w:szCs w:val="24"/>
         </w:rPr>
-        <w:lastRenderedPageBreak/>
         <w:t>Yes — this can absolutely evolve into a hospital-grade commercial platform</w:t>
       </w:r>
     </w:p>
@@ -3922,6 +3877,7 @@
           <w:sz w:val="24"/>
           <w:szCs w:val="24"/>
         </w:rPr>
+        <w:lastRenderedPageBreak/>
         <w:t>Patient Registration</w:t>
       </w:r>
       <w:r>
@@ -3985,14 +3941,6 @@
           <w:szCs w:val="24"/>
         </w:rPr>
         <w:br/>
-      </w:r>
-      <w:r>
-        <w:rPr>
-          <w:rFonts w:ascii="Times New Roman" w:hAnsi="Times New Roman" w:cs="Times New Roman"/>
-          <w:sz w:val="24"/>
-          <w:szCs w:val="24"/>
-        </w:rPr>
-        <w:lastRenderedPageBreak/>
         <w:t xml:space="preserve">        ↓</w:t>
       </w:r>
       <w:r>
@@ -4441,6 +4389,7 @@
           <w:sz w:val="24"/>
           <w:szCs w:val="24"/>
         </w:rPr>
+        <w:lastRenderedPageBreak/>
         <w:t>Predict:</w:t>
       </w:r>
     </w:p>
@@ -4563,7 +4512,6 @@
           <w:sz w:val="24"/>
           <w:szCs w:val="24"/>
         </w:rPr>
-        <w:lastRenderedPageBreak/>
         <w:t xml:space="preserve">blood sugar </w:t>
       </w:r>
     </w:p>
@@ -5004,6 +4952,7 @@
           <w:sz w:val="24"/>
           <w:szCs w:val="24"/>
         </w:rPr>
+        <w:lastRenderedPageBreak/>
         <w:t>6. Cancer Risk Screening</w:t>
       </w:r>
     </w:p>
@@ -5157,7 +5106,6 @@
           <w:sz w:val="24"/>
           <w:szCs w:val="24"/>
         </w:rPr>
-        <w:lastRenderedPageBreak/>
         <w:t>8. Drug Interaction Warning Engine</w:t>
       </w:r>
     </w:p>
@@ -5573,6 +5521,7 @@
           <w:sz w:val="24"/>
           <w:szCs w:val="24"/>
         </w:rPr>
+        <w:lastRenderedPageBreak/>
         <w:pict w14:anchorId="3A362A27">
           <v:rect id="_x0000_i1193" style="width:0;height:1.5pt" o:hralign="center" o:hrstd="t" o:hr="t" fillcolor="#a0a0a0" stroked="f"/>
         </w:pict>
@@ -5717,7 +5666,6 @@
           <w:sz w:val="24"/>
           <w:szCs w:val="24"/>
         </w:rPr>
-        <w:lastRenderedPageBreak/>
         <w:t>Clinical support</w:t>
       </w:r>
     </w:p>
@@ -6109,6 +6057,7 @@
           <w:sz w:val="24"/>
           <w:szCs w:val="24"/>
         </w:rPr>
+        <w:lastRenderedPageBreak/>
         <w:t>ML</w:t>
       </w:r>
       <w:r>
@@ -6257,7 +6206,6 @@
           <w:sz w:val="24"/>
           <w:szCs w:val="24"/>
         </w:rPr>
-        <w:lastRenderedPageBreak/>
         <w:t>But:</w:t>
       </w:r>
     </w:p>
@@ -6705,6 +6653,7 @@
                 <w:sz w:val="24"/>
                 <w:szCs w:val="24"/>
               </w:rPr>
+              <w:lastRenderedPageBreak/>
               <w:t>Medium Hospital</w:t>
             </w:r>
           </w:p>
@@ -6942,7 +6891,1274 @@
         <w:t xml:space="preserve">patient privacy </w:t>
       </w:r>
     </w:p>
+    <w:p>
+      <w:pPr>
+        <w:rPr>
+          <w:rFonts w:ascii="Times New Roman" w:hAnsi="Times New Roman" w:cs="Times New Roman"/>
+          <w:b/>
+          <w:bCs/>
+          <w:sz w:val="24"/>
+          <w:szCs w:val="24"/>
+        </w:rPr>
+      </w:pPr>
+      <w:r>
+        <w:rPr>
+          <w:rFonts w:ascii="Times New Roman" w:hAnsi="Times New Roman" w:cs="Times New Roman"/>
+          <w:b/>
+          <w:bCs/>
+          <w:sz w:val="24"/>
+          <w:szCs w:val="24"/>
+        </w:rPr>
+        <w:t>Architecture Upgrade (Big Vision)</w:t>
+      </w:r>
+    </w:p>
+    <w:p>
+      <w:pPr>
+        <w:rPr>
+          <w:rFonts w:ascii="Times New Roman" w:hAnsi="Times New Roman" w:cs="Times New Roman"/>
+          <w:sz w:val="24"/>
+          <w:szCs w:val="24"/>
+        </w:rPr>
+      </w:pPr>
+      <w:r>
+        <w:rPr>
+          <w:rFonts w:ascii="Times New Roman" w:hAnsi="Times New Roman" w:cs="Times New Roman"/>
+          <w:sz w:val="24"/>
+          <w:szCs w:val="24"/>
+        </w:rPr>
+        <w:t>To your earlier question:</w:t>
+      </w:r>
+    </w:p>
+    <w:p>
+      <w:pPr>
+        <w:rPr>
+          <w:rFonts w:ascii="Times New Roman" w:hAnsi="Times New Roman" w:cs="Times New Roman"/>
+          <w:sz w:val="24"/>
+          <w:szCs w:val="24"/>
+        </w:rPr>
+      </w:pPr>
+      <w:r>
+        <w:rPr>
+          <w:rFonts w:ascii="Times New Roman" w:hAnsi="Times New Roman" w:cs="Times New Roman"/>
+          <w:sz w:val="24"/>
+          <w:szCs w:val="24"/>
+        </w:rPr>
+        <w:t>Yes.</w:t>
+      </w:r>
+    </w:p>
+    <w:p>
+      <w:pPr>
+        <w:rPr>
+          <w:rFonts w:ascii="Times New Roman" w:hAnsi="Times New Roman" w:cs="Times New Roman"/>
+          <w:sz w:val="24"/>
+          <w:szCs w:val="24"/>
+        </w:rPr>
+      </w:pPr>
+      <w:r>
+        <w:rPr>
+          <w:rFonts w:ascii="Times New Roman" w:hAnsi="Times New Roman" w:cs="Times New Roman"/>
+          <w:sz w:val="24"/>
+          <w:szCs w:val="24"/>
+        </w:rPr>
+        <w:t xml:space="preserve">This project can absolutely evolve into a </w:t>
+      </w:r>
+      <w:r>
+        <w:rPr>
+          <w:rFonts w:ascii="Times New Roman" w:hAnsi="Times New Roman" w:cs="Times New Roman"/>
+          <w:b/>
+          <w:bCs/>
+          <w:sz w:val="24"/>
+          <w:szCs w:val="24"/>
+        </w:rPr>
+        <w:t>commercial hospital platform</w:t>
+      </w:r>
+      <w:r>
+        <w:rPr>
+          <w:rFonts w:ascii="Times New Roman" w:hAnsi="Times New Roman" w:cs="Times New Roman"/>
+          <w:sz w:val="24"/>
+          <w:szCs w:val="24"/>
+        </w:rPr>
+        <w:t>.</w:t>
+      </w:r>
+    </w:p>
+    <w:p>
+      <w:pPr>
+        <w:rPr>
+          <w:rFonts w:ascii="Times New Roman" w:hAnsi="Times New Roman" w:cs="Times New Roman"/>
+          <w:sz w:val="24"/>
+          <w:szCs w:val="24"/>
+        </w:rPr>
+      </w:pPr>
+      <w:r>
+        <w:rPr>
+          <w:rFonts w:ascii="Times New Roman" w:hAnsi="Times New Roman" w:cs="Times New Roman"/>
+          <w:sz w:val="24"/>
+          <w:szCs w:val="24"/>
+        </w:rPr>
+        <w:t>The strongest future direction is:</w:t>
+      </w:r>
+    </w:p>
+    <w:p>
+      <w:pPr>
+        <w:rPr>
+          <w:rFonts w:ascii="Times New Roman" w:hAnsi="Times New Roman" w:cs="Times New Roman"/>
+          <w:b/>
+          <w:bCs/>
+          <w:sz w:val="24"/>
+          <w:szCs w:val="24"/>
+        </w:rPr>
+      </w:pPr>
+      <w:r>
+        <w:rPr>
+          <w:rFonts w:ascii="Times New Roman" w:hAnsi="Times New Roman" w:cs="Times New Roman"/>
+          <w:b/>
+          <w:bCs/>
+          <w:sz w:val="24"/>
+          <w:szCs w:val="24"/>
+        </w:rPr>
+        <w:t>AI Healthcare Decision Support Platform</w:t>
+      </w:r>
+    </w:p>
+    <w:p>
+      <w:pPr>
+        <w:rPr>
+          <w:rFonts w:ascii="Times New Roman" w:hAnsi="Times New Roman" w:cs="Times New Roman"/>
+          <w:sz w:val="24"/>
+          <w:szCs w:val="24"/>
+        </w:rPr>
+      </w:pPr>
+      <w:r>
+        <w:rPr>
+          <w:rFonts w:ascii="Times New Roman" w:hAnsi="Times New Roman" w:cs="Times New Roman"/>
+          <w:sz w:val="24"/>
+          <w:szCs w:val="24"/>
+        </w:rPr>
+        <w:t>Modules:</w:t>
+      </w:r>
+    </w:p>
+    <w:p>
+      <w:pPr>
+        <w:numPr>
+          <w:ilvl w:val="0"/>
+          <w:numId w:val="13"/>
+        </w:numPr>
+        <w:rPr>
+          <w:rFonts w:ascii="Times New Roman" w:hAnsi="Times New Roman" w:cs="Times New Roman"/>
+          <w:sz w:val="24"/>
+          <w:szCs w:val="24"/>
+        </w:rPr>
+      </w:pPr>
+      <w:r>
+        <w:rPr>
+          <w:rFonts w:ascii="Times New Roman" w:hAnsi="Times New Roman" w:cs="Times New Roman"/>
+          <w:sz w:val="24"/>
+          <w:szCs w:val="24"/>
+        </w:rPr>
+        <w:t xml:space="preserve">Malaria Prediction </w:t>
+      </w:r>
+    </w:p>
+    <w:p>
+      <w:pPr>
+        <w:numPr>
+          <w:ilvl w:val="0"/>
+          <w:numId w:val="13"/>
+        </w:numPr>
+        <w:rPr>
+          <w:rFonts w:ascii="Times New Roman" w:hAnsi="Times New Roman" w:cs="Times New Roman"/>
+          <w:sz w:val="24"/>
+          <w:szCs w:val="24"/>
+        </w:rPr>
+      </w:pPr>
+      <w:r>
+        <w:rPr>
+          <w:rFonts w:ascii="Times New Roman" w:hAnsi="Times New Roman" w:cs="Times New Roman"/>
+          <w:sz w:val="24"/>
+          <w:szCs w:val="24"/>
+        </w:rPr>
+        <w:t xml:space="preserve">Diabetes Risk Prediction </w:t>
+      </w:r>
+    </w:p>
+    <w:p>
+      <w:pPr>
+        <w:numPr>
+          <w:ilvl w:val="0"/>
+          <w:numId w:val="13"/>
+        </w:numPr>
+        <w:rPr>
+          <w:rFonts w:ascii="Times New Roman" w:hAnsi="Times New Roman" w:cs="Times New Roman"/>
+          <w:sz w:val="24"/>
+          <w:szCs w:val="24"/>
+        </w:rPr>
+      </w:pPr>
+      <w:r>
+        <w:rPr>
+          <w:rFonts w:ascii="Times New Roman" w:hAnsi="Times New Roman" w:cs="Times New Roman"/>
+          <w:sz w:val="24"/>
+          <w:szCs w:val="24"/>
+        </w:rPr>
+        <w:t xml:space="preserve">Hypertension Prediction </w:t>
+      </w:r>
+    </w:p>
+    <w:p>
+      <w:pPr>
+        <w:numPr>
+          <w:ilvl w:val="0"/>
+          <w:numId w:val="13"/>
+        </w:numPr>
+        <w:rPr>
+          <w:rFonts w:ascii="Times New Roman" w:hAnsi="Times New Roman" w:cs="Times New Roman"/>
+          <w:sz w:val="24"/>
+          <w:szCs w:val="24"/>
+        </w:rPr>
+      </w:pPr>
+      <w:r>
+        <w:rPr>
+          <w:rFonts w:ascii="Times New Roman" w:hAnsi="Times New Roman" w:cs="Times New Roman"/>
+          <w:sz w:val="24"/>
+          <w:szCs w:val="24"/>
+        </w:rPr>
+        <w:t xml:space="preserve">Maternal Risk Monitoring </w:t>
+      </w:r>
+    </w:p>
+    <w:p>
+      <w:pPr>
+        <w:numPr>
+          <w:ilvl w:val="0"/>
+          <w:numId w:val="13"/>
+        </w:numPr>
+        <w:rPr>
+          <w:rFonts w:ascii="Times New Roman" w:hAnsi="Times New Roman" w:cs="Times New Roman"/>
+          <w:sz w:val="24"/>
+          <w:szCs w:val="24"/>
+        </w:rPr>
+      </w:pPr>
+      <w:r>
+        <w:rPr>
+          <w:rFonts w:ascii="Times New Roman" w:hAnsi="Times New Roman" w:cs="Times New Roman"/>
+          <w:sz w:val="24"/>
+          <w:szCs w:val="24"/>
+        </w:rPr>
+        <w:t xml:space="preserve">Sepsis Early Warning </w:t>
+      </w:r>
+    </w:p>
+    <w:p>
+      <w:pPr>
+        <w:numPr>
+          <w:ilvl w:val="0"/>
+          <w:numId w:val="13"/>
+        </w:numPr>
+        <w:rPr>
+          <w:rFonts w:ascii="Times New Roman" w:hAnsi="Times New Roman" w:cs="Times New Roman"/>
+          <w:sz w:val="24"/>
+          <w:szCs w:val="24"/>
+        </w:rPr>
+      </w:pPr>
+      <w:proofErr w:type="spellStart"/>
+      <w:r>
+        <w:rPr>
+          <w:rFonts w:ascii="Times New Roman" w:hAnsi="Times New Roman" w:cs="Times New Roman"/>
+          <w:sz w:val="24"/>
+          <w:szCs w:val="24"/>
+        </w:rPr>
+        <w:t>Pediatric</w:t>
+      </w:r>
+      <w:proofErr w:type="spellEnd"/>
+      <w:r>
+        <w:rPr>
+          <w:rFonts w:ascii="Times New Roman" w:hAnsi="Times New Roman" w:cs="Times New Roman"/>
+          <w:sz w:val="24"/>
+          <w:szCs w:val="24"/>
+        </w:rPr>
+        <w:t xml:space="preserve"> Triage </w:t>
+      </w:r>
+    </w:p>
+    <w:p>
+      <w:pPr>
+        <w:numPr>
+          <w:ilvl w:val="0"/>
+          <w:numId w:val="13"/>
+        </w:numPr>
+        <w:rPr>
+          <w:rFonts w:ascii="Times New Roman" w:hAnsi="Times New Roman" w:cs="Times New Roman"/>
+          <w:sz w:val="24"/>
+          <w:szCs w:val="24"/>
+        </w:rPr>
+      </w:pPr>
+      <w:r>
+        <w:rPr>
+          <w:rFonts w:ascii="Times New Roman" w:hAnsi="Times New Roman" w:cs="Times New Roman"/>
+          <w:sz w:val="24"/>
+          <w:szCs w:val="24"/>
+        </w:rPr>
+        <w:t xml:space="preserve">Lab Result Interpretation </w:t>
+      </w:r>
+    </w:p>
+    <w:p>
+      <w:pPr>
+        <w:numPr>
+          <w:ilvl w:val="0"/>
+          <w:numId w:val="13"/>
+        </w:numPr>
+        <w:rPr>
+          <w:rFonts w:ascii="Times New Roman" w:hAnsi="Times New Roman" w:cs="Times New Roman"/>
+          <w:sz w:val="24"/>
+          <w:szCs w:val="24"/>
+        </w:rPr>
+      </w:pPr>
+      <w:r>
+        <w:rPr>
+          <w:rFonts w:ascii="Times New Roman" w:hAnsi="Times New Roman" w:cs="Times New Roman"/>
+          <w:sz w:val="24"/>
+          <w:szCs w:val="24"/>
+        </w:rPr>
+        <w:t xml:space="preserve">Drug Recommendation Support </w:t>
+      </w:r>
+    </w:p>
+    <w:p>
+      <w:pPr>
+        <w:numPr>
+          <w:ilvl w:val="0"/>
+          <w:numId w:val="13"/>
+        </w:numPr>
+        <w:rPr>
+          <w:rFonts w:ascii="Times New Roman" w:hAnsi="Times New Roman" w:cs="Times New Roman"/>
+          <w:sz w:val="24"/>
+          <w:szCs w:val="24"/>
+        </w:rPr>
+      </w:pPr>
+      <w:r>
+        <w:rPr>
+          <w:rFonts w:ascii="Times New Roman" w:hAnsi="Times New Roman" w:cs="Times New Roman"/>
+          <w:sz w:val="24"/>
+          <w:szCs w:val="24"/>
+        </w:rPr>
+        <w:t xml:space="preserve">Electronic Medical Records (MIS) </w:t>
+      </w:r>
+    </w:p>
+    <w:p>
+      <w:pPr>
+        <w:numPr>
+          <w:ilvl w:val="0"/>
+          <w:numId w:val="13"/>
+        </w:numPr>
+        <w:rPr>
+          <w:rFonts w:ascii="Times New Roman" w:hAnsi="Times New Roman" w:cs="Times New Roman"/>
+          <w:sz w:val="24"/>
+          <w:szCs w:val="24"/>
+        </w:rPr>
+      </w:pPr>
+      <w:r>
+        <w:rPr>
+          <w:rFonts w:ascii="Times New Roman" w:hAnsi="Times New Roman" w:cs="Times New Roman"/>
+          <w:sz w:val="24"/>
+          <w:szCs w:val="24"/>
+        </w:rPr>
+        <w:t xml:space="preserve">Explainable Clinical Intelligence Layer </w:t>
+      </w:r>
+    </w:p>
+    <w:p>
+      <w:pPr>
+        <w:rPr>
+          <w:rFonts w:ascii="Times New Roman" w:hAnsi="Times New Roman" w:cs="Times New Roman"/>
+          <w:sz w:val="24"/>
+          <w:szCs w:val="24"/>
+        </w:rPr>
+      </w:pPr>
+      <w:r>
+        <w:rPr>
+          <w:rFonts w:ascii="Times New Roman" w:hAnsi="Times New Roman" w:cs="Times New Roman"/>
+          <w:sz w:val="24"/>
+          <w:szCs w:val="24"/>
+        </w:rPr>
+        <w:lastRenderedPageBreak/>
+        <w:t>Architecture:</w:t>
+      </w:r>
+    </w:p>
+    <w:p>
+      <w:pPr>
+        <w:rPr>
+          <w:rFonts w:ascii="Times New Roman" w:hAnsi="Times New Roman" w:cs="Times New Roman"/>
+          <w:sz w:val="24"/>
+          <w:szCs w:val="24"/>
+        </w:rPr>
+      </w:pPr>
+      <w:r>
+        <w:rPr>
+          <w:rFonts w:ascii="Times New Roman" w:hAnsi="Times New Roman" w:cs="Times New Roman"/>
+          <w:sz w:val="24"/>
+          <w:szCs w:val="24"/>
+        </w:rPr>
+        <w:t>Hospital MIS Layer</w:t>
+      </w:r>
+      <w:r>
+        <w:rPr>
+          <w:rFonts w:ascii="Times New Roman" w:hAnsi="Times New Roman" w:cs="Times New Roman"/>
+          <w:sz w:val="24"/>
+          <w:szCs w:val="24"/>
+        </w:rPr>
+        <w:br/>
+        <w:t xml:space="preserve">        ↓</w:t>
+      </w:r>
+      <w:r>
+        <w:rPr>
+          <w:rFonts w:ascii="Times New Roman" w:hAnsi="Times New Roman" w:cs="Times New Roman"/>
+          <w:sz w:val="24"/>
+          <w:szCs w:val="24"/>
+        </w:rPr>
+        <w:br/>
+        <w:t>Patient Records</w:t>
+      </w:r>
+      <w:r>
+        <w:rPr>
+          <w:rFonts w:ascii="Times New Roman" w:hAnsi="Times New Roman" w:cs="Times New Roman"/>
+          <w:sz w:val="24"/>
+          <w:szCs w:val="24"/>
+        </w:rPr>
+        <w:br/>
+        <w:t xml:space="preserve">        ↓</w:t>
+      </w:r>
+      <w:r>
+        <w:rPr>
+          <w:rFonts w:ascii="Times New Roman" w:hAnsi="Times New Roman" w:cs="Times New Roman"/>
+          <w:sz w:val="24"/>
+          <w:szCs w:val="24"/>
+        </w:rPr>
+        <w:br/>
+        <w:t>Prediction Engine Hub</w:t>
+      </w:r>
+      <w:r>
+        <w:rPr>
+          <w:rFonts w:ascii="Times New Roman" w:hAnsi="Times New Roman" w:cs="Times New Roman"/>
+          <w:sz w:val="24"/>
+          <w:szCs w:val="24"/>
+        </w:rPr>
+        <w:br/>
+        <w:t xml:space="preserve">        ↓</w:t>
+      </w:r>
+      <w:r>
+        <w:rPr>
+          <w:rFonts w:ascii="Times New Roman" w:hAnsi="Times New Roman" w:cs="Times New Roman"/>
+          <w:sz w:val="24"/>
+          <w:szCs w:val="24"/>
+        </w:rPr>
+        <w:br/>
+        <w:t>Disease-specific Models</w:t>
+      </w:r>
+      <w:r>
+        <w:rPr>
+          <w:rFonts w:ascii="Times New Roman" w:hAnsi="Times New Roman" w:cs="Times New Roman"/>
+          <w:sz w:val="24"/>
+          <w:szCs w:val="24"/>
+        </w:rPr>
+        <w:br/>
+        <w:t xml:space="preserve">        ↓</w:t>
+      </w:r>
+      <w:r>
+        <w:rPr>
+          <w:rFonts w:ascii="Times New Roman" w:hAnsi="Times New Roman" w:cs="Times New Roman"/>
+          <w:sz w:val="24"/>
+          <w:szCs w:val="24"/>
+        </w:rPr>
+        <w:br/>
+        <w:t>Explainability Layer (SHAP/XAI)</w:t>
+      </w:r>
+      <w:r>
+        <w:rPr>
+          <w:rFonts w:ascii="Times New Roman" w:hAnsi="Times New Roman" w:cs="Times New Roman"/>
+          <w:sz w:val="24"/>
+          <w:szCs w:val="24"/>
+        </w:rPr>
+        <w:br/>
+        <w:t xml:space="preserve">        ↓</w:t>
+      </w:r>
+      <w:r>
+        <w:rPr>
+          <w:rFonts w:ascii="Times New Roman" w:hAnsi="Times New Roman" w:cs="Times New Roman"/>
+          <w:sz w:val="24"/>
+          <w:szCs w:val="24"/>
+        </w:rPr>
+        <w:br/>
+        <w:t>Clinical Recommendations</w:t>
+      </w:r>
+      <w:r>
+        <w:rPr>
+          <w:rFonts w:ascii="Times New Roman" w:hAnsi="Times New Roman" w:cs="Times New Roman"/>
+          <w:sz w:val="24"/>
+          <w:szCs w:val="24"/>
+        </w:rPr>
+        <w:br/>
+        <w:t xml:space="preserve">        ↓</w:t>
+      </w:r>
+      <w:r>
+        <w:rPr>
+          <w:rFonts w:ascii="Times New Roman" w:hAnsi="Times New Roman" w:cs="Times New Roman"/>
+          <w:sz w:val="24"/>
+          <w:szCs w:val="24"/>
+        </w:rPr>
+        <w:br/>
+        <w:t>Audit + Governance Layer</w:t>
+      </w:r>
+    </w:p>
+    <w:p>
+      <w:pPr>
+        <w:rPr>
+          <w:rFonts w:ascii="Times New Roman" w:hAnsi="Times New Roman" w:cs="Times New Roman"/>
+          <w:sz w:val="24"/>
+          <w:szCs w:val="24"/>
+        </w:rPr>
+      </w:pPr>
+      <w:r>
+        <w:rPr>
+          <w:rFonts w:ascii="Times New Roman" w:hAnsi="Times New Roman" w:cs="Times New Roman"/>
+          <w:sz w:val="24"/>
+          <w:szCs w:val="24"/>
+        </w:rPr>
+        <w:t>This becomes:</w:t>
+      </w:r>
+    </w:p>
+    <w:p>
+      <w:pPr>
+        <w:rPr>
+          <w:rFonts w:ascii="Times New Roman" w:hAnsi="Times New Roman" w:cs="Times New Roman"/>
+          <w:sz w:val="24"/>
+          <w:szCs w:val="24"/>
+        </w:rPr>
+      </w:pPr>
+      <w:r>
+        <w:rPr>
+          <w:rFonts w:ascii="Times New Roman" w:hAnsi="Times New Roman" w:cs="Times New Roman"/>
+          <w:b/>
+          <w:bCs/>
+          <w:sz w:val="24"/>
+          <w:szCs w:val="24"/>
+        </w:rPr>
+        <w:t>Trustworthy AI for Healthcare Decision Support</w:t>
+      </w:r>
+    </w:p>
+    <w:p>
+      <w:pPr>
+        <w:rPr>
+          <w:rFonts w:ascii="Times New Roman" w:hAnsi="Times New Roman" w:cs="Times New Roman"/>
+          <w:sz w:val="24"/>
+          <w:szCs w:val="24"/>
+        </w:rPr>
+      </w:pPr>
+      <w:r>
+        <w:rPr>
+          <w:rFonts w:ascii="Times New Roman" w:hAnsi="Times New Roman" w:cs="Times New Roman"/>
+          <w:sz w:val="24"/>
+          <w:szCs w:val="24"/>
+        </w:rPr>
+        <w:t>That is far stronger than:</w:t>
+      </w:r>
+    </w:p>
+    <w:p>
+      <w:pPr>
+        <w:rPr>
+          <w:rFonts w:ascii="Times New Roman" w:hAnsi="Times New Roman" w:cs="Times New Roman"/>
+          <w:sz w:val="24"/>
+          <w:szCs w:val="24"/>
+        </w:rPr>
+      </w:pPr>
+      <w:r>
+        <w:rPr>
+          <w:rFonts w:ascii="Times New Roman" w:hAnsi="Times New Roman" w:cs="Times New Roman"/>
+          <w:sz w:val="24"/>
+          <w:szCs w:val="24"/>
+        </w:rPr>
+        <w:t>“I built a malaria model.”</w:t>
+      </w:r>
+    </w:p>
+    <w:p>
+      <w:pPr>
+        <w:rPr>
+          <w:rFonts w:ascii="Times New Roman" w:hAnsi="Times New Roman" w:cs="Times New Roman"/>
+          <w:sz w:val="24"/>
+          <w:szCs w:val="24"/>
+        </w:rPr>
+      </w:pPr>
+      <w:r>
+        <w:rPr>
+          <w:rFonts w:ascii="Times New Roman" w:hAnsi="Times New Roman" w:cs="Times New Roman"/>
+          <w:sz w:val="24"/>
+          <w:szCs w:val="24"/>
+        </w:rPr>
+        <w:t>It becomes:</w:t>
+      </w:r>
+    </w:p>
+    <w:p>
+      <w:pPr>
+        <w:rPr>
+          <w:rFonts w:ascii="Times New Roman" w:hAnsi="Times New Roman" w:cs="Times New Roman"/>
+          <w:sz w:val="24"/>
+          <w:szCs w:val="24"/>
+        </w:rPr>
+      </w:pPr>
+      <w:r>
+        <w:rPr>
+          <w:rFonts w:ascii="Times New Roman" w:hAnsi="Times New Roman" w:cs="Times New Roman"/>
+          <w:sz w:val="24"/>
+          <w:szCs w:val="24"/>
+        </w:rPr>
+        <w:t>“I designed explainable, clinically auditable AI infrastructure.”</w:t>
+      </w:r>
+    </w:p>
+    <w:p>
+      <w:pPr>
+        <w:rPr>
+          <w:rFonts w:ascii="Times New Roman" w:hAnsi="Times New Roman" w:cs="Times New Roman"/>
+          <w:sz w:val="24"/>
+          <w:szCs w:val="24"/>
+        </w:rPr>
+      </w:pPr>
+      <w:r>
+        <w:rPr>
+          <w:rFonts w:ascii="Times New Roman" w:hAnsi="Times New Roman" w:cs="Times New Roman"/>
+          <w:sz w:val="24"/>
+          <w:szCs w:val="24"/>
+        </w:rPr>
+        <w:t>Huge difference.</w:t>
+      </w:r>
+    </w:p>
+    <w:p>
+      <w:pPr>
+        <w:rPr>
+          <w:rFonts w:ascii="Times New Roman" w:hAnsi="Times New Roman" w:cs="Times New Roman"/>
+          <w:sz w:val="24"/>
+          <w:szCs w:val="24"/>
+        </w:rPr>
+      </w:pPr>
+      <w:r>
+        <w:rPr>
+          <w:rFonts w:ascii="Times New Roman" w:hAnsi="Times New Roman" w:cs="Times New Roman"/>
+          <w:sz w:val="24"/>
+          <w:szCs w:val="24"/>
+        </w:rPr>
+        <w:pict w14:anchorId="421871F0">
+          <v:rect id="_x0000_i1234" style="width:0;height:1.5pt" o:hralign="center" o:hrstd="t" o:hr="t" fillcolor="#a0a0a0" stroked="f"/>
+        </w:pict>
+      </w:r>
+    </w:p>
+    <w:p>
+      <w:pPr>
+        <w:rPr>
+          <w:rFonts w:ascii="Times New Roman" w:hAnsi="Times New Roman" w:cs="Times New Roman"/>
+          <w:b/>
+          <w:bCs/>
+          <w:sz w:val="24"/>
+          <w:szCs w:val="24"/>
+        </w:rPr>
+      </w:pPr>
+      <w:r>
+        <w:rPr>
+          <w:rFonts w:ascii="Times New Roman" w:hAnsi="Times New Roman" w:cs="Times New Roman"/>
+          <w:b/>
+          <w:bCs/>
+          <w:sz w:val="24"/>
+          <w:szCs w:val="24"/>
+        </w:rPr>
+        <w:t>PHASE 3B STARTS NOW</w:t>
+      </w:r>
+    </w:p>
+    <w:p>
+      <w:pPr>
+        <w:rPr>
+          <w:rFonts w:ascii="Times New Roman" w:hAnsi="Times New Roman" w:cs="Times New Roman"/>
+          <w:sz w:val="24"/>
+          <w:szCs w:val="24"/>
+        </w:rPr>
+      </w:pPr>
+      <w:r>
+        <w:rPr>
+          <w:rFonts w:ascii="Times New Roman" w:hAnsi="Times New Roman" w:cs="Times New Roman"/>
+          <w:sz w:val="24"/>
+          <w:szCs w:val="24"/>
+        </w:rPr>
+        <w:t>Next file:</w:t>
+      </w:r>
+    </w:p>
+    <w:p>
+      <w:pPr>
+        <w:rPr>
+          <w:rFonts w:ascii="Times New Roman" w:hAnsi="Times New Roman" w:cs="Times New Roman"/>
+          <w:b/>
+          <w:bCs/>
+          <w:sz w:val="24"/>
+          <w:szCs w:val="24"/>
+        </w:rPr>
+      </w:pPr>
+      <w:r>
+        <w:rPr>
+          <w:rFonts w:ascii="Times New Roman" w:hAnsi="Times New Roman" w:cs="Times New Roman"/>
+          <w:b/>
+          <w:bCs/>
+          <w:sz w:val="24"/>
+          <w:szCs w:val="24"/>
+        </w:rPr>
+        <w:t>src/ui.py</w:t>
+      </w:r>
+    </w:p>
+    <w:p>
+      <w:pPr>
+        <w:rPr>
+          <w:rFonts w:ascii="Times New Roman" w:hAnsi="Times New Roman" w:cs="Times New Roman"/>
+          <w:sz w:val="24"/>
+          <w:szCs w:val="24"/>
+        </w:rPr>
+      </w:pPr>
+      <w:r>
+        <w:rPr>
+          <w:rFonts w:ascii="Times New Roman" w:hAnsi="Times New Roman" w:cs="Times New Roman"/>
+          <w:sz w:val="24"/>
+          <w:szCs w:val="24"/>
+        </w:rPr>
+        <w:t>We are upgrading it into:</w:t>
+      </w:r>
+    </w:p>
+    <w:p>
+      <w:pPr>
+        <w:rPr>
+          <w:rFonts w:ascii="Times New Roman" w:hAnsi="Times New Roman" w:cs="Times New Roman"/>
+          <w:sz w:val="24"/>
+          <w:szCs w:val="24"/>
+        </w:rPr>
+      </w:pPr>
+      <w:r>
+        <w:rPr>
+          <w:rFonts w:ascii="Times New Roman" w:hAnsi="Times New Roman" w:cs="Times New Roman"/>
+          <w:b/>
+          <w:bCs/>
+          <w:sz w:val="24"/>
+          <w:szCs w:val="24"/>
+        </w:rPr>
+        <w:t>Malaria Clinical AI Dashboard v3</w:t>
+      </w:r>
+    </w:p>
+    <w:p>
+      <w:pPr>
+        <w:rPr>
+          <w:rFonts w:ascii="Times New Roman" w:hAnsi="Times New Roman" w:cs="Times New Roman"/>
+          <w:sz w:val="24"/>
+          <w:szCs w:val="24"/>
+        </w:rPr>
+      </w:pPr>
+      <w:r>
+        <w:rPr>
+          <w:rFonts w:ascii="Times New Roman" w:hAnsi="Times New Roman" w:cs="Times New Roman"/>
+          <w:sz w:val="24"/>
+          <w:szCs w:val="24"/>
+        </w:rPr>
+        <w:t>with:</w:t>
+      </w:r>
+    </w:p>
+    <w:p>
+      <w:pPr>
+        <w:numPr>
+          <w:ilvl w:val="0"/>
+          <w:numId w:val="14"/>
+        </w:numPr>
+        <w:rPr>
+          <w:rFonts w:ascii="Times New Roman" w:hAnsi="Times New Roman" w:cs="Times New Roman"/>
+          <w:sz w:val="24"/>
+          <w:szCs w:val="24"/>
+        </w:rPr>
+      </w:pPr>
+      <w:r>
+        <w:rPr>
+          <w:rFonts w:ascii="Times New Roman" w:hAnsi="Times New Roman" w:cs="Times New Roman"/>
+          <w:sz w:val="24"/>
+          <w:szCs w:val="24"/>
+        </w:rPr>
+        <w:t xml:space="preserve">framed UI </w:t>
+      </w:r>
+    </w:p>
+    <w:p>
+      <w:pPr>
+        <w:numPr>
+          <w:ilvl w:val="0"/>
+          <w:numId w:val="14"/>
+        </w:numPr>
+        <w:rPr>
+          <w:rFonts w:ascii="Times New Roman" w:hAnsi="Times New Roman" w:cs="Times New Roman"/>
+          <w:sz w:val="24"/>
+          <w:szCs w:val="24"/>
+        </w:rPr>
+      </w:pPr>
+      <w:r>
+        <w:rPr>
+          <w:rFonts w:ascii="Times New Roman" w:hAnsi="Times New Roman" w:cs="Times New Roman"/>
+          <w:sz w:val="24"/>
+          <w:szCs w:val="24"/>
+        </w:rPr>
+        <w:t xml:space="preserve">clean sections </w:t>
+      </w:r>
+    </w:p>
+    <w:p>
+      <w:pPr>
+        <w:numPr>
+          <w:ilvl w:val="0"/>
+          <w:numId w:val="14"/>
+        </w:numPr>
+        <w:rPr>
+          <w:rFonts w:ascii="Times New Roman" w:hAnsi="Times New Roman" w:cs="Times New Roman"/>
+          <w:sz w:val="24"/>
+          <w:szCs w:val="24"/>
+        </w:rPr>
+      </w:pPr>
+      <w:r>
+        <w:rPr>
+          <w:rFonts w:ascii="Times New Roman" w:hAnsi="Times New Roman" w:cs="Times New Roman"/>
+          <w:sz w:val="24"/>
+          <w:szCs w:val="24"/>
+        </w:rPr>
+        <w:t xml:space="preserve">visual separation </w:t>
+      </w:r>
+    </w:p>
+    <w:p>
+      <w:pPr>
+        <w:numPr>
+          <w:ilvl w:val="0"/>
+          <w:numId w:val="14"/>
+        </w:numPr>
+        <w:rPr>
+          <w:rFonts w:ascii="Times New Roman" w:hAnsi="Times New Roman" w:cs="Times New Roman"/>
+          <w:sz w:val="24"/>
+          <w:szCs w:val="24"/>
+        </w:rPr>
+      </w:pPr>
+      <w:r>
+        <w:rPr>
+          <w:rFonts w:ascii="Times New Roman" w:hAnsi="Times New Roman" w:cs="Times New Roman"/>
+          <w:sz w:val="24"/>
+          <w:szCs w:val="24"/>
+        </w:rPr>
+        <w:t xml:space="preserve">chart selector </w:t>
+      </w:r>
+    </w:p>
+    <w:p>
+      <w:pPr>
+        <w:numPr>
+          <w:ilvl w:val="0"/>
+          <w:numId w:val="14"/>
+        </w:numPr>
+        <w:rPr>
+          <w:rFonts w:ascii="Times New Roman" w:hAnsi="Times New Roman" w:cs="Times New Roman"/>
+          <w:sz w:val="24"/>
+          <w:szCs w:val="24"/>
+        </w:rPr>
+      </w:pPr>
+      <w:r>
+        <w:rPr>
+          <w:rFonts w:ascii="Times New Roman" w:hAnsi="Times New Roman" w:cs="Times New Roman"/>
+          <w:sz w:val="24"/>
+          <w:szCs w:val="24"/>
+        </w:rPr>
+        <w:t xml:space="preserve">SHAP charts </w:t>
+      </w:r>
+    </w:p>
+    <w:p>
+      <w:pPr>
+        <w:numPr>
+          <w:ilvl w:val="0"/>
+          <w:numId w:val="14"/>
+        </w:numPr>
+        <w:rPr>
+          <w:rFonts w:ascii="Times New Roman" w:hAnsi="Times New Roman" w:cs="Times New Roman"/>
+          <w:sz w:val="24"/>
+          <w:szCs w:val="24"/>
+        </w:rPr>
+      </w:pPr>
+      <w:r>
+        <w:rPr>
+          <w:rFonts w:ascii="Times New Roman" w:hAnsi="Times New Roman" w:cs="Times New Roman"/>
+          <w:sz w:val="24"/>
+          <w:szCs w:val="24"/>
+        </w:rPr>
+        <w:lastRenderedPageBreak/>
+        <w:t xml:space="preserve">clinician explanations </w:t>
+      </w:r>
+    </w:p>
+    <w:p>
+      <w:pPr>
+        <w:numPr>
+          <w:ilvl w:val="0"/>
+          <w:numId w:val="14"/>
+        </w:numPr>
+        <w:rPr>
+          <w:rFonts w:ascii="Times New Roman" w:hAnsi="Times New Roman" w:cs="Times New Roman"/>
+          <w:sz w:val="24"/>
+          <w:szCs w:val="24"/>
+        </w:rPr>
+      </w:pPr>
+      <w:r>
+        <w:rPr>
+          <w:rFonts w:ascii="Times New Roman" w:hAnsi="Times New Roman" w:cs="Times New Roman"/>
+          <w:sz w:val="24"/>
+          <w:szCs w:val="24"/>
+        </w:rPr>
+        <w:t xml:space="preserve">recommendation engine </w:t>
+      </w:r>
+    </w:p>
+    <w:p>
+      <w:pPr>
+        <w:numPr>
+          <w:ilvl w:val="0"/>
+          <w:numId w:val="14"/>
+        </w:numPr>
+        <w:rPr>
+          <w:rFonts w:ascii="Times New Roman" w:hAnsi="Times New Roman" w:cs="Times New Roman"/>
+          <w:sz w:val="24"/>
+          <w:szCs w:val="24"/>
+        </w:rPr>
+      </w:pPr>
+      <w:r>
+        <w:rPr>
+          <w:rFonts w:ascii="Times New Roman" w:hAnsi="Times New Roman" w:cs="Times New Roman"/>
+          <w:sz w:val="24"/>
+          <w:szCs w:val="24"/>
+        </w:rPr>
+        <w:t xml:space="preserve">presentation-ready styling </w:t>
+      </w:r>
+    </w:p>
+    <w:p>
+      <w:pPr>
+        <w:rPr>
+          <w:rFonts w:ascii="Times New Roman" w:hAnsi="Times New Roman" w:cs="Times New Roman"/>
+          <w:sz w:val="24"/>
+          <w:szCs w:val="24"/>
+        </w:rPr>
+      </w:pPr>
+      <w:r>
+        <w:rPr>
+          <w:rFonts w:ascii="Times New Roman" w:hAnsi="Times New Roman" w:cs="Times New Roman"/>
+          <w:sz w:val="24"/>
+          <w:szCs w:val="24"/>
+        </w:rPr>
+        <w:t>Before I generate the full ui.py v3, one design decision:</w:t>
+      </w:r>
+    </w:p>
+    <w:p>
+      <w:pPr>
+        <w:rPr>
+          <w:rFonts w:ascii="Times New Roman" w:hAnsi="Times New Roman" w:cs="Times New Roman"/>
+          <w:sz w:val="24"/>
+          <w:szCs w:val="24"/>
+        </w:rPr>
+      </w:pPr>
+      <w:r>
+        <w:rPr>
+          <w:rFonts w:ascii="Times New Roman" w:hAnsi="Times New Roman" w:cs="Times New Roman"/>
+          <w:sz w:val="24"/>
+          <w:szCs w:val="24"/>
+        </w:rPr>
+        <w:t>Do you want:</w:t>
+      </w:r>
+    </w:p>
+    <w:p>
+      <w:pPr>
+        <w:rPr>
+          <w:rFonts w:ascii="Times New Roman" w:hAnsi="Times New Roman" w:cs="Times New Roman"/>
+          <w:b/>
+          <w:bCs/>
+          <w:sz w:val="24"/>
+          <w:szCs w:val="24"/>
+        </w:rPr>
+      </w:pPr>
+      <w:r>
+        <w:rPr>
+          <w:rFonts w:ascii="Times New Roman" w:hAnsi="Times New Roman" w:cs="Times New Roman"/>
+          <w:b/>
+          <w:bCs/>
+          <w:sz w:val="24"/>
+          <w:szCs w:val="24"/>
+        </w:rPr>
+        <w:t>Option A — Professional Clinical Theme</w:t>
+      </w:r>
+    </w:p>
+    <w:p>
+      <w:pPr>
+        <w:rPr>
+          <w:rFonts w:ascii="Times New Roman" w:hAnsi="Times New Roman" w:cs="Times New Roman"/>
+          <w:sz w:val="24"/>
+          <w:szCs w:val="24"/>
+        </w:rPr>
+      </w:pPr>
+      <w:r>
+        <w:rPr>
+          <w:rFonts w:ascii="Times New Roman" w:hAnsi="Times New Roman" w:cs="Times New Roman"/>
+          <w:sz w:val="24"/>
+          <w:szCs w:val="24"/>
+        </w:rPr>
+        <w:t>(clean hospital dashboard)</w:t>
+      </w:r>
+    </w:p>
+    <w:p>
+      <w:pPr>
+        <w:numPr>
+          <w:ilvl w:val="0"/>
+          <w:numId w:val="15"/>
+        </w:numPr>
+        <w:rPr>
+          <w:rFonts w:ascii="Times New Roman" w:hAnsi="Times New Roman" w:cs="Times New Roman"/>
+          <w:sz w:val="24"/>
+          <w:szCs w:val="24"/>
+        </w:rPr>
+      </w:pPr>
+      <w:r>
+        <w:rPr>
+          <w:rFonts w:ascii="Times New Roman" w:hAnsi="Times New Roman" w:cs="Times New Roman"/>
+          <w:sz w:val="24"/>
+          <w:szCs w:val="24"/>
+        </w:rPr>
+        <w:t xml:space="preserve">white background </w:t>
+      </w:r>
+    </w:p>
+    <w:p>
+      <w:pPr>
+        <w:numPr>
+          <w:ilvl w:val="0"/>
+          <w:numId w:val="15"/>
+        </w:numPr>
+        <w:rPr>
+          <w:rFonts w:ascii="Times New Roman" w:hAnsi="Times New Roman" w:cs="Times New Roman"/>
+          <w:sz w:val="24"/>
+          <w:szCs w:val="24"/>
+        </w:rPr>
+      </w:pPr>
+      <w:r>
+        <w:rPr>
+          <w:rFonts w:ascii="Times New Roman" w:hAnsi="Times New Roman" w:cs="Times New Roman"/>
+          <w:sz w:val="24"/>
+          <w:szCs w:val="24"/>
+        </w:rPr>
+        <w:t xml:space="preserve">blue highlights </w:t>
+      </w:r>
+    </w:p>
+    <w:p>
+      <w:pPr>
+        <w:numPr>
+          <w:ilvl w:val="0"/>
+          <w:numId w:val="15"/>
+        </w:numPr>
+        <w:rPr>
+          <w:rFonts w:ascii="Times New Roman" w:hAnsi="Times New Roman" w:cs="Times New Roman"/>
+          <w:sz w:val="24"/>
+          <w:szCs w:val="24"/>
+        </w:rPr>
+      </w:pPr>
+      <w:r>
+        <w:rPr>
+          <w:rFonts w:ascii="Times New Roman" w:hAnsi="Times New Roman" w:cs="Times New Roman"/>
+          <w:sz w:val="24"/>
+          <w:szCs w:val="24"/>
+        </w:rPr>
+        <w:t xml:space="preserve">subtle shadows </w:t>
+      </w:r>
+    </w:p>
+    <w:p>
+      <w:pPr>
+        <w:numPr>
+          <w:ilvl w:val="0"/>
+          <w:numId w:val="15"/>
+        </w:numPr>
+        <w:rPr>
+          <w:rFonts w:ascii="Times New Roman" w:hAnsi="Times New Roman" w:cs="Times New Roman"/>
+          <w:sz w:val="24"/>
+          <w:szCs w:val="24"/>
+        </w:rPr>
+      </w:pPr>
+      <w:r>
+        <w:rPr>
+          <w:rFonts w:ascii="Times New Roman" w:hAnsi="Times New Roman" w:cs="Times New Roman"/>
+          <w:sz w:val="24"/>
+          <w:szCs w:val="24"/>
+        </w:rPr>
+        <w:t xml:space="preserve">executive feel </w:t>
+      </w:r>
+    </w:p>
+    <w:p>
+      <w:pPr>
+        <w:rPr>
+          <w:rFonts w:ascii="Times New Roman" w:hAnsi="Times New Roman" w:cs="Times New Roman"/>
+          <w:b/>
+          <w:bCs/>
+          <w:sz w:val="24"/>
+          <w:szCs w:val="24"/>
+        </w:rPr>
+      </w:pPr>
+      <w:r>
+        <w:rPr>
+          <w:rFonts w:ascii="Times New Roman" w:hAnsi="Times New Roman" w:cs="Times New Roman"/>
+          <w:b/>
+          <w:bCs/>
+          <w:sz w:val="24"/>
+          <w:szCs w:val="24"/>
+        </w:rPr>
+        <w:t>Option B — Research + Executive Theme</w:t>
+      </w:r>
+    </w:p>
+    <w:p>
+      <w:pPr>
+        <w:rPr>
+          <w:rFonts w:ascii="Times New Roman" w:hAnsi="Times New Roman" w:cs="Times New Roman"/>
+          <w:sz w:val="24"/>
+          <w:szCs w:val="24"/>
+        </w:rPr>
+      </w:pPr>
+      <w:r>
+        <w:rPr>
+          <w:rFonts w:ascii="Times New Roman" w:hAnsi="Times New Roman" w:cs="Times New Roman"/>
+          <w:sz w:val="24"/>
+          <w:szCs w:val="24"/>
+        </w:rPr>
+        <w:t>(best for portfolio/demo)</w:t>
+      </w:r>
+    </w:p>
+    <w:p>
+      <w:pPr>
+        <w:numPr>
+          <w:ilvl w:val="0"/>
+          <w:numId w:val="16"/>
+        </w:numPr>
+        <w:rPr>
+          <w:rFonts w:ascii="Times New Roman" w:hAnsi="Times New Roman" w:cs="Times New Roman"/>
+          <w:sz w:val="24"/>
+          <w:szCs w:val="24"/>
+        </w:rPr>
+      </w:pPr>
+      <w:proofErr w:type="spellStart"/>
+      <w:r>
+        <w:rPr>
+          <w:rFonts w:ascii="Times New Roman" w:hAnsi="Times New Roman" w:cs="Times New Roman"/>
+          <w:sz w:val="24"/>
+          <w:szCs w:val="24"/>
+        </w:rPr>
+        <w:t>glassmorphism</w:t>
+      </w:r>
+      <w:proofErr w:type="spellEnd"/>
+      <w:r>
+        <w:rPr>
+          <w:rFonts w:ascii="Times New Roman" w:hAnsi="Times New Roman" w:cs="Times New Roman"/>
+          <w:sz w:val="24"/>
+          <w:szCs w:val="24"/>
+        </w:rPr>
+        <w:t xml:space="preserve"> cards </w:t>
+      </w:r>
+    </w:p>
+    <w:p>
+      <w:pPr>
+        <w:numPr>
+          <w:ilvl w:val="0"/>
+          <w:numId w:val="16"/>
+        </w:numPr>
+        <w:rPr>
+          <w:rFonts w:ascii="Times New Roman" w:hAnsi="Times New Roman" w:cs="Times New Roman"/>
+          <w:sz w:val="24"/>
+          <w:szCs w:val="24"/>
+        </w:rPr>
+      </w:pPr>
+      <w:r>
+        <w:rPr>
+          <w:rFonts w:ascii="Times New Roman" w:hAnsi="Times New Roman" w:cs="Times New Roman"/>
+          <w:sz w:val="24"/>
+          <w:szCs w:val="24"/>
+        </w:rPr>
+        <w:t xml:space="preserve">richer visual analytics </w:t>
+      </w:r>
+    </w:p>
+    <w:p>
+      <w:pPr>
+        <w:numPr>
+          <w:ilvl w:val="0"/>
+          <w:numId w:val="16"/>
+        </w:numPr>
+        <w:rPr>
+          <w:rFonts w:ascii="Times New Roman" w:hAnsi="Times New Roman" w:cs="Times New Roman"/>
+          <w:sz w:val="24"/>
+          <w:szCs w:val="24"/>
+        </w:rPr>
+      </w:pPr>
+      <w:r>
+        <w:rPr>
+          <w:rFonts w:ascii="Times New Roman" w:hAnsi="Times New Roman" w:cs="Times New Roman"/>
+          <w:sz w:val="24"/>
+          <w:szCs w:val="24"/>
+        </w:rPr>
+        <w:t xml:space="preserve">premium dashboard feel </w:t>
+      </w:r>
+    </w:p>
+    <w:p>
+      <w:pPr>
+        <w:numPr>
+          <w:ilvl w:val="0"/>
+          <w:numId w:val="16"/>
+        </w:numPr>
+        <w:rPr>
+          <w:rFonts w:ascii="Times New Roman" w:hAnsi="Times New Roman" w:cs="Times New Roman"/>
+          <w:sz w:val="24"/>
+          <w:szCs w:val="24"/>
+        </w:rPr>
+      </w:pPr>
+      <w:r>
+        <w:rPr>
+          <w:rFonts w:ascii="Times New Roman" w:hAnsi="Times New Roman" w:cs="Times New Roman"/>
+          <w:sz w:val="24"/>
+          <w:szCs w:val="24"/>
+        </w:rPr>
+        <w:t xml:space="preserve">stronger for presentations </w:t>
+      </w:r>
+    </w:p>
+    <w:p>
+      <w:pPr>
+        <w:rPr>
+          <w:rFonts w:ascii="Times New Roman" w:hAnsi="Times New Roman" w:cs="Times New Roman"/>
+          <w:sz w:val="24"/>
+          <w:szCs w:val="24"/>
+        </w:rPr>
+      </w:pPr>
+      <w:r>
+        <w:rPr>
+          <w:rFonts w:ascii="Times New Roman" w:hAnsi="Times New Roman" w:cs="Times New Roman"/>
+          <w:sz w:val="24"/>
+          <w:szCs w:val="24"/>
+        </w:rPr>
+        <w:t xml:space="preserve">Given your conference/research orientation, I’d lean toward </w:t>
+      </w:r>
+      <w:r>
+        <w:rPr>
+          <w:rFonts w:ascii="Times New Roman" w:hAnsi="Times New Roman" w:cs="Times New Roman"/>
+          <w:b/>
+          <w:bCs/>
+          <w:sz w:val="24"/>
+          <w:szCs w:val="24"/>
+        </w:rPr>
+        <w:t>B</w:t>
+      </w:r>
+      <w:r>
+        <w:rPr>
+          <w:rFonts w:ascii="Times New Roman" w:hAnsi="Times New Roman" w:cs="Times New Roman"/>
+          <w:sz w:val="24"/>
+          <w:szCs w:val="24"/>
+        </w:rPr>
+        <w:t>, but still professional enough for hospitals.</w:t>
+      </w:r>
+    </w:p>
+    <w:p>
+      <w:pPr>
+        <w:rPr>
+          <w:rFonts w:ascii="Times New Roman" w:hAnsi="Times New Roman" w:cs="Times New Roman"/>
+          <w:sz w:val="24"/>
+          <w:szCs w:val="24"/>
+        </w:rPr>
+      </w:pPr>
+    </w:p>
     <w:sectPr>
+      <w:headerReference w:type="even" r:id="rId7"/>
+      <w:headerReference w:type="default" r:id="rId8"/>
+      <w:footerReference w:type="even" r:id="rId9"/>
+      <w:footerReference w:type="default" r:id="rId10"/>
+      <w:headerReference w:type="first" r:id="rId11"/>
+      <w:footerReference w:type="first" r:id="rId12"/>
       <w:pgSz w:w="11906" w:h="16838"/>
       <w:pgMar w:top="709" w:right="1440" w:bottom="993" w:left="1440" w:header="708" w:footer="708" w:gutter="0"/>
       <w:cols w:space="708"/>
@@ -6952,6 +8168,159 @@
 </w:document>
 </file>
 
+<file path=word/endnotes.xml><?xml version="1.0" encoding="utf-8"?>
+<w:endnotes xmlns:wpc="http://schemas.microsoft.com/office/word/2010/wordprocessingCanvas" xmlns:cx="http://schemas.microsoft.com/office/drawing/2014/chartex" xmlns:cx1="http://schemas.microsoft.com/office/drawing/2015/9/8/chartex" xmlns:cx2="http://schemas.microsoft.com/office/drawing/2015/10/21/chartex" xmlns:cx3="http://schemas.microsoft.com/office/drawing/2016/5/9/chartex" xmlns:cx4="http://schemas.microsoft.com/office/drawing/2016/5/10/chartex" xmlns:cx5="http://schemas.microsoft.com/office/drawing/2016/5/11/chartex" xmlns:cx6="http://schemas.microsoft.com/office/drawing/2016/5/12/chartex" xmlns:cx7="http://schemas.microsoft.com/office/drawing/2016/5/13/chartex" xmlns:cx8="http://schemas.microsoft.com/office/drawing/2016/5/14/chartex" xmlns:mc="http://schemas.openxmlformats.org/markup-compatibility/2006" xmlns:aink="http://schemas.microsoft.com/office/drawing/2016/ink" xmlns:am3d="http://schemas.microsoft.com/office/drawing/2017/model3d" xmlns:o="urn:schemas-microsoft-com:office:office" xmlns:oel="http://schemas.microsoft.com/office/2019/extlst" xmlns:r="http://schemas.openxmlformats.org/officeDocument/2006/relationships" xmlns:m="http://schemas.openxmlformats.org/officeDocument/2006/math" xmlns:v="urn:schemas-microsoft-com:vml" xmlns:wp14="http://schemas.microsoft.com/office/word/2010/wordprocessingDrawing" xmlns:wp="http://schemas.openxmlformats.org/drawingml/2006/wordprocessingDrawing" xmlns:w10="urn:schemas-microsoft-com:office:word" xmlns:w="http://schemas.openxmlformats.org/wordprocessingml/2006/main" xmlns:w14="http://schemas.microsoft.com/office/word/2010/wordml" xmlns:w15="http://schemas.microsoft.com/office/word/2012/wordml" xmlns:w16cex="http://schemas.microsoft.com/office/word/2018/wordml/cex" xmlns:w16cid="http://schemas.microsoft.com/office/word/2016/wordml/cid" xmlns:w16="http://schemas.microsoft.com/office/word/2018/wordml" xmlns:w16du="http://schemas.microsoft.com/office/word/2023/wordml/word16du" xmlns:w16sdtdh="http://schemas.microsoft.com/office/word/2020/wordml/sdtdatahash" xmlns:w16sdtfl="http://schemas.microsoft.com/office/word/2024/wordml/sdtformatlock" xmlns:w16se="http://schemas.microsoft.com/office/word/2015/wordml/symex" xmlns:wpg="http://schemas.microsoft.com/office/word/2010/wordprocessingGroup" xmlns:wpi="http://schemas.microsoft.com/office/word/2010/wordprocessingInk" xmlns:wne="http://schemas.microsoft.com/office/word/2006/wordml" xmlns:wps="http://schemas.microsoft.com/office/word/2010/wordprocessingShape" mc:Ignorable="w14 w15 w16se w16cid w16 w16cex w16sdtdh w16sdtfl w16du wp14">
+  <w:endnote w:type="separator" w:id="-1">
+    <w:p>
+      <w:pPr>
+        <w:spacing w:after="0" w:line="240" w:lineRule="auto"/>
+      </w:pPr>
+      <w:r>
+        <w:separator/>
+      </w:r>
+    </w:p>
+  </w:endnote>
+  <w:endnote w:type="continuationSeparator" w:id="0">
+    <w:p>
+      <w:pPr>
+        <w:spacing w:after="0" w:line="240" w:lineRule="auto"/>
+      </w:pPr>
+      <w:r>
+        <w:continuationSeparator/>
+      </w:r>
+    </w:p>
+  </w:endnote>
+</w:endnotes>
+</file>
+
+<file path=word/footer1.xml><?xml version="1.0" encoding="utf-8"?>
+<w:ftr xmlns:wpc="http://schemas.microsoft.com/office/word/2010/wordprocessingCanvas" xmlns:cx="http://schemas.microsoft.com/office/drawing/2014/chartex" xmlns:cx1="http://schemas.microsoft.com/office/drawing/2015/9/8/chartex" xmlns:cx2="http://schemas.microsoft.com/office/drawing/2015/10/21/chartex" xmlns:cx3="http://schemas.microsoft.com/office/drawing/2016/5/9/chartex" xmlns:cx4="http://schemas.microsoft.com/office/drawing/2016/5/10/chartex" xmlns:cx5="http://schemas.microsoft.com/office/drawing/2016/5/11/chartex" xmlns:cx6="http://schemas.microsoft.com/office/drawing/2016/5/12/chartex" xmlns:cx7="http://schemas.microsoft.com/office/drawing/2016/5/13/chartex" xmlns:cx8="http://schemas.microsoft.com/office/drawing/2016/5/14/chartex" xmlns:mc="http://schemas.openxmlformats.org/markup-compatibility/2006" xmlns:aink="http://schemas.microsoft.com/office/drawing/2016/ink" xmlns:am3d="http://schemas.microsoft.com/office/drawing/2017/model3d" xmlns:o="urn:schemas-microsoft-com:office:office" xmlns:oel="http://schemas.microsoft.com/office/2019/extlst" xmlns:r="http://schemas.openxmlformats.org/officeDocument/2006/relationships" xmlns:m="http://schemas.openxmlformats.org/officeDocument/2006/math" xmlns:v="urn:schemas-microsoft-com:vml" xmlns:wp14="http://schemas.microsoft.com/office/word/2010/wordprocessingDrawing" xmlns:wp="http://schemas.openxmlformats.org/drawingml/2006/wordprocessingDrawing" xmlns:w10="urn:schemas-microsoft-com:office:word" xmlns:w="http://schemas.openxmlformats.org/wordprocessingml/2006/main" xmlns:w14="http://schemas.microsoft.com/office/word/2010/wordml" xmlns:w15="http://schemas.microsoft.com/office/word/2012/wordml" xmlns:w16cex="http://schemas.microsoft.com/office/word/2018/wordml/cex" xmlns:w16cid="http://schemas.microsoft.com/office/word/2016/wordml/cid" xmlns:w16="http://schemas.microsoft.com/office/word/2018/wordml" xmlns:w16du="http://schemas.microsoft.com/office/word/2023/wordml/word16du" xmlns:w16sdtdh="http://schemas.microsoft.com/office/word/2020/wordml/sdtdatahash" xmlns:w16sdtfl="http://schemas.microsoft.com/office/word/2024/wordml/sdtformatlock" xmlns:w16se="http://schemas.microsoft.com/office/word/2015/wordml/symex" xmlns:wpg="http://schemas.microsoft.com/office/word/2010/wordprocessingGroup" xmlns:wpi="http://schemas.microsoft.com/office/word/2010/wordprocessingInk" xmlns:wne="http://schemas.microsoft.com/office/word/2006/wordml" xmlns:wps="http://schemas.microsoft.com/office/word/2010/wordprocessingShape" mc:Ignorable="w14 w15 w16se w16cid w16 w16cex w16sdtdh w16sdtfl w16du wp14">
+  <w:p>
+    <w:pPr>
+      <w:pStyle w:val="Footer"/>
+    </w:pPr>
+  </w:p>
+</w:ftr>
+</file>
+
+<file path=word/footer2.xml><?xml version="1.0" encoding="utf-8"?>
+<w:ftr xmlns:wpc="http://schemas.microsoft.com/office/word/2010/wordprocessingCanvas" xmlns:cx="http://schemas.microsoft.com/office/drawing/2014/chartex" xmlns:cx1="http://schemas.microsoft.com/office/drawing/2015/9/8/chartex" xmlns:cx2="http://schemas.microsoft.com/office/drawing/2015/10/21/chartex" xmlns:cx3="http://schemas.microsoft.com/office/drawing/2016/5/9/chartex" xmlns:cx4="http://schemas.microsoft.com/office/drawing/2016/5/10/chartex" xmlns:cx5="http://schemas.microsoft.com/office/drawing/2016/5/11/chartex" xmlns:cx6="http://schemas.microsoft.com/office/drawing/2016/5/12/chartex" xmlns:cx7="http://schemas.microsoft.com/office/drawing/2016/5/13/chartex" xmlns:cx8="http://schemas.microsoft.com/office/drawing/2016/5/14/chartex" xmlns:mc="http://schemas.openxmlformats.org/markup-compatibility/2006" xmlns:aink="http://schemas.microsoft.com/office/drawing/2016/ink" xmlns:am3d="http://schemas.microsoft.com/office/drawing/2017/model3d" xmlns:o="urn:schemas-microsoft-com:office:office" xmlns:oel="http://schemas.microsoft.com/office/2019/extlst" xmlns:r="http://schemas.openxmlformats.org/officeDocument/2006/relationships" xmlns:m="http://schemas.openxmlformats.org/officeDocument/2006/math" xmlns:v="urn:schemas-microsoft-com:vml" xmlns:wp14="http://schemas.microsoft.com/office/word/2010/wordprocessingDrawing" xmlns:wp="http://schemas.openxmlformats.org/drawingml/2006/wordprocessingDrawing" xmlns:w10="urn:schemas-microsoft-com:office:word" xmlns:w="http://schemas.openxmlformats.org/wordprocessingml/2006/main" xmlns:w14="http://schemas.microsoft.com/office/word/2010/wordml" xmlns:w15="http://schemas.microsoft.com/office/word/2012/wordml" xmlns:w16cex="http://schemas.microsoft.com/office/word/2018/wordml/cex" xmlns:w16cid="http://schemas.microsoft.com/office/word/2016/wordml/cid" xmlns:w16="http://schemas.microsoft.com/office/word/2018/wordml" xmlns:w16du="http://schemas.microsoft.com/office/word/2023/wordml/word16du" xmlns:w16sdtdh="http://schemas.microsoft.com/office/word/2020/wordml/sdtdatahash" xmlns:w16sdtfl="http://schemas.microsoft.com/office/word/2024/wordml/sdtformatlock" xmlns:w16se="http://schemas.microsoft.com/office/word/2015/wordml/symex" xmlns:wpg="http://schemas.microsoft.com/office/word/2010/wordprocessingGroup" xmlns:wpi="http://schemas.microsoft.com/office/word/2010/wordprocessingInk" xmlns:wne="http://schemas.microsoft.com/office/word/2006/wordml" xmlns:wps="http://schemas.microsoft.com/office/word/2010/wordprocessingShape" mc:Ignorable="w14 w15 w16se w16cid w16 w16cex w16sdtdh w16sdtfl w16du wp14">
+  <w:sdt>
+    <w:sdtPr>
+      <w:id w:val="883370994"/>
+      <w:docPartObj>
+        <w:docPartGallery w:val="Page Numbers (Bottom of Page)"/>
+        <w:docPartUnique/>
+      </w:docPartObj>
+    </w:sdtPr>
+    <w:sdtEndPr>
+      <w:rPr>
+        <w:noProof/>
+      </w:rPr>
+    </w:sdtEndPr>
+    <w:sdtContent>
+      <w:p>
+        <w:pPr>
+          <w:pStyle w:val="Footer"/>
+          <w:jc w:val="right"/>
+        </w:pPr>
+        <w:r>
+          <w:fldChar w:fldCharType="begin"/>
+        </w:r>
+        <w:r>
+          <w:instrText xml:space="preserve"> PAGE   \* MERGEFORMAT </w:instrText>
+        </w:r>
+        <w:r>
+          <w:fldChar w:fldCharType="separate"/>
+        </w:r>
+        <w:r>
+          <w:rPr>
+            <w:noProof/>
+          </w:rPr>
+          <w:t>2</w:t>
+        </w:r>
+        <w:r>
+          <w:rPr>
+            <w:noProof/>
+          </w:rPr>
+          <w:fldChar w:fldCharType="end"/>
+        </w:r>
+      </w:p>
+    </w:sdtContent>
+  </w:sdt>
+  <w:p>
+    <w:pPr>
+      <w:pStyle w:val="Footer"/>
+    </w:pPr>
+  </w:p>
+</w:ftr>
+</file>
+
+<file path=word/footer3.xml><?xml version="1.0" encoding="utf-8"?>
+<w:ftr xmlns:wpc="http://schemas.microsoft.com/office/word/2010/wordprocessingCanvas" xmlns:cx="http://schemas.microsoft.com/office/drawing/2014/chartex" xmlns:cx1="http://schemas.microsoft.com/office/drawing/2015/9/8/chartex" xmlns:cx2="http://schemas.microsoft.com/office/drawing/2015/10/21/chartex" xmlns:cx3="http://schemas.microsoft.com/office/drawing/2016/5/9/chartex" xmlns:cx4="http://schemas.microsoft.com/office/drawing/2016/5/10/chartex" xmlns:cx5="http://schemas.microsoft.com/office/drawing/2016/5/11/chartex" xmlns:cx6="http://schemas.microsoft.com/office/drawing/2016/5/12/chartex" xmlns:cx7="http://schemas.microsoft.com/office/drawing/2016/5/13/chartex" xmlns:cx8="http://schemas.microsoft.com/office/drawing/2016/5/14/chartex" xmlns:mc="http://schemas.openxmlformats.org/markup-compatibility/2006" xmlns:aink="http://schemas.microsoft.com/office/drawing/2016/ink" xmlns:am3d="http://schemas.microsoft.com/office/drawing/2017/model3d" xmlns:o="urn:schemas-microsoft-com:office:office" xmlns:oel="http://schemas.microsoft.com/office/2019/extlst" xmlns:r="http://schemas.openxmlformats.org/officeDocument/2006/relationships" xmlns:m="http://schemas.openxmlformats.org/officeDocument/2006/math" xmlns:v="urn:schemas-microsoft-com:vml" xmlns:wp14="http://schemas.microsoft.com/office/word/2010/wordprocessingDrawing" xmlns:wp="http://schemas.openxmlformats.org/drawingml/2006/wordprocessingDrawing" xmlns:w10="urn:schemas-microsoft-com:office:word" xmlns:w="http://schemas.openxmlformats.org/wordprocessingml/2006/main" xmlns:w14="http://schemas.microsoft.com/office/word/2010/wordml" xmlns:w15="http://schemas.microsoft.com/office/word/2012/wordml" xmlns:w16cex="http://schemas.microsoft.com/office/word/2018/wordml/cex" xmlns:w16cid="http://schemas.microsoft.com/office/word/2016/wordml/cid" xmlns:w16="http://schemas.microsoft.com/office/word/2018/wordml" xmlns:w16du="http://schemas.microsoft.com/office/word/2023/wordml/word16du" xmlns:w16sdtdh="http://schemas.microsoft.com/office/word/2020/wordml/sdtdatahash" xmlns:w16sdtfl="http://schemas.microsoft.com/office/word/2024/wordml/sdtformatlock" xmlns:w16se="http://schemas.microsoft.com/office/word/2015/wordml/symex" xmlns:wpg="http://schemas.microsoft.com/office/word/2010/wordprocessingGroup" xmlns:wpi="http://schemas.microsoft.com/office/word/2010/wordprocessingInk" xmlns:wne="http://schemas.microsoft.com/office/word/2006/wordml" xmlns:wps="http://schemas.microsoft.com/office/word/2010/wordprocessingShape" mc:Ignorable="w14 w15 w16se w16cid w16 w16cex w16sdtdh w16sdtfl w16du wp14">
+  <w:p>
+    <w:pPr>
+      <w:pStyle w:val="Footer"/>
+    </w:pPr>
+  </w:p>
+</w:ftr>
+</file>
+
+<file path=word/footnotes.xml><?xml version="1.0" encoding="utf-8"?>
+<w:footnotes xmlns:wpc="http://schemas.microsoft.com/office/word/2010/wordprocessingCanvas" xmlns:cx="http://schemas.microsoft.com/office/drawing/2014/chartex" xmlns:cx1="http://schemas.microsoft.com/office/drawing/2015/9/8/chartex" xmlns:cx2="http://schemas.microsoft.com/office/drawing/2015/10/21/chartex" xmlns:cx3="http://schemas.microsoft.com/office/drawing/2016/5/9/chartex" xmlns:cx4="http://schemas.microsoft.com/office/drawing/2016/5/10/chartex" xmlns:cx5="http://schemas.microsoft.com/office/drawing/2016/5/11/chartex" xmlns:cx6="http://schemas.microsoft.com/office/drawing/2016/5/12/chartex" xmlns:cx7="http://schemas.microsoft.com/office/drawing/2016/5/13/chartex" xmlns:cx8="http://schemas.microsoft.com/office/drawing/2016/5/14/chartex" xmlns:mc="http://schemas.openxmlformats.org/markup-compatibility/2006" xmlns:aink="http://schemas.microsoft.com/office/drawing/2016/ink" xmlns:am3d="http://schemas.microsoft.com/office/drawing/2017/model3d" xmlns:o="urn:schemas-microsoft-com:office:office" xmlns:oel="http://schemas.microsoft.com/office/2019/extlst" xmlns:r="http://schemas.openxmlformats.org/officeDocument/2006/relationships" xmlns:m="http://schemas.openxmlformats.org/officeDocument/2006/math" xmlns:v="urn:schemas-microsoft-com:vml" xmlns:wp14="http://schemas.microsoft.com/office/word/2010/wordprocessingDrawing" xmlns:wp="http://schemas.openxmlformats.org/drawingml/2006/wordprocessingDrawing" xmlns:w10="urn:schemas-microsoft-com:office:word" xmlns:w="http://schemas.openxmlformats.org/wordprocessingml/2006/main" xmlns:w14="http://schemas.microsoft.com/office/word/2010/wordml" xmlns:w15="http://schemas.microsoft.com/office/word/2012/wordml" xmlns:w16cex="http://schemas.microsoft.com/office/word/2018/wordml/cex" xmlns:w16cid="http://schemas.microsoft.com/office/word/2016/wordml/cid" xmlns:w16="http://schemas.microsoft.com/office/word/2018/wordml" xmlns:w16du="http://schemas.microsoft.com/office/word/2023/wordml/word16du" xmlns:w16sdtdh="http://schemas.microsoft.com/office/word/2020/wordml/sdtdatahash" xmlns:w16sdtfl="http://schemas.microsoft.com/office/word/2024/wordml/sdtformatlock" xmlns:w16se="http://schemas.microsoft.com/office/word/2015/wordml/symex" xmlns:wpg="http://schemas.microsoft.com/office/word/2010/wordprocessingGroup" xmlns:wpi="http://schemas.microsoft.com/office/word/2010/wordprocessingInk" xmlns:wne="http://schemas.microsoft.com/office/word/2006/wordml" xmlns:wps="http://schemas.microsoft.com/office/word/2010/wordprocessingShape" mc:Ignorable="w14 w15 w16se w16cid w16 w16cex w16sdtdh w16sdtfl w16du wp14">
+  <w:footnote w:type="separator" w:id="-1">
+    <w:p>
+      <w:pPr>
+        <w:spacing w:after="0" w:line="240" w:lineRule="auto"/>
+      </w:pPr>
+      <w:r>
+        <w:separator/>
+      </w:r>
+    </w:p>
+  </w:footnote>
+  <w:footnote w:type="continuationSeparator" w:id="0">
+    <w:p>
+      <w:pPr>
+        <w:spacing w:after="0" w:line="240" w:lineRule="auto"/>
+      </w:pPr>
+      <w:r>
+        <w:continuationSeparator/>
+      </w:r>
+    </w:p>
+  </w:footnote>
+</w:footnotes>
+</file>
+
+<file path=word/header1.xml><?xml version="1.0" encoding="utf-8"?>
+<w:hdr xmlns:wpc="http://schemas.microsoft.com/office/word/2010/wordprocessingCanvas" xmlns:cx="http://schemas.microsoft.com/office/drawing/2014/chartex" xmlns:cx1="http://schemas.microsoft.com/office/drawing/2015/9/8/chartex" xmlns:cx2="http://schemas.microsoft.com/office/drawing/2015/10/21/chartex" xmlns:cx3="http://schemas.microsoft.com/office/drawing/2016/5/9/chartex" xmlns:cx4="http://schemas.microsoft.com/office/drawing/2016/5/10/chartex" xmlns:cx5="http://schemas.microsoft.com/office/drawing/2016/5/11/chartex" xmlns:cx6="http://schemas.microsoft.com/office/drawing/2016/5/12/chartex" xmlns:cx7="http://schemas.microsoft.com/office/drawing/2016/5/13/chartex" xmlns:cx8="http://schemas.microsoft.com/office/drawing/2016/5/14/chartex" xmlns:mc="http://schemas.openxmlformats.org/markup-compatibility/2006" xmlns:aink="http://schemas.microsoft.com/office/drawing/2016/ink" xmlns:am3d="http://schemas.microsoft.com/office/drawing/2017/model3d" xmlns:o="urn:schemas-microsoft-com:office:office" xmlns:oel="http://schemas.microsoft.com/office/2019/extlst" xmlns:r="http://schemas.openxmlformats.org/officeDocument/2006/relationships" xmlns:m="http://schemas.openxmlformats.org/officeDocument/2006/math" xmlns:v="urn:schemas-microsoft-com:vml" xmlns:wp14="http://schemas.microsoft.com/office/word/2010/wordprocessingDrawing" xmlns:wp="http://schemas.openxmlformats.org/drawingml/2006/wordprocessingDrawing" xmlns:w10="urn:schemas-microsoft-com:office:word" xmlns:w="http://schemas.openxmlformats.org/wordprocessingml/2006/main" xmlns:w14="http://schemas.microsoft.com/office/word/2010/wordml" xmlns:w15="http://schemas.microsoft.com/office/word/2012/wordml" xmlns:w16cex="http://schemas.microsoft.com/office/word/2018/wordml/cex" xmlns:w16cid="http://schemas.microsoft.com/office/word/2016/wordml/cid" xmlns:w16="http://schemas.microsoft.com/office/word/2018/wordml" xmlns:w16du="http://schemas.microsoft.com/office/word/2023/wordml/word16du" xmlns:w16sdtdh="http://schemas.microsoft.com/office/word/2020/wordml/sdtdatahash" xmlns:w16sdtfl="http://schemas.microsoft.com/office/word/2024/wordml/sdtformatlock" xmlns:w16se="http://schemas.microsoft.com/office/word/2015/wordml/symex" xmlns:wpg="http://schemas.microsoft.com/office/word/2010/wordprocessingGroup" xmlns:wpi="http://schemas.microsoft.com/office/word/2010/wordprocessingInk" xmlns:wne="http://schemas.microsoft.com/office/word/2006/wordml" xmlns:wps="http://schemas.microsoft.com/office/word/2010/wordprocessingShape" mc:Ignorable="w14 w15 w16se w16cid w16 w16cex w16sdtdh w16sdtfl w16du wp14">
+  <w:p>
+    <w:pPr>
+      <w:pStyle w:val="Header"/>
+    </w:pPr>
+  </w:p>
+</w:hdr>
+</file>
+
+<file path=word/header2.xml><?xml version="1.0" encoding="utf-8"?>
+<w:hdr xmlns:wpc="http://schemas.microsoft.com/office/word/2010/wordprocessingCanvas" xmlns:cx="http://schemas.microsoft.com/office/drawing/2014/chartex" xmlns:cx1="http://schemas.microsoft.com/office/drawing/2015/9/8/chartex" xmlns:cx2="http://schemas.microsoft.com/office/drawing/2015/10/21/chartex" xmlns:cx3="http://schemas.microsoft.com/office/drawing/2016/5/9/chartex" xmlns:cx4="http://schemas.microsoft.com/office/drawing/2016/5/10/chartex" xmlns:cx5="http://schemas.microsoft.com/office/drawing/2016/5/11/chartex" xmlns:cx6="http://schemas.microsoft.com/office/drawing/2016/5/12/chartex" xmlns:cx7="http://schemas.microsoft.com/office/drawing/2016/5/13/chartex" xmlns:cx8="http://schemas.microsoft.com/office/drawing/2016/5/14/chartex" xmlns:mc="http://schemas.openxmlformats.org/markup-compatibility/2006" xmlns:aink="http://schemas.microsoft.com/office/drawing/2016/ink" xmlns:am3d="http://schemas.microsoft.com/office/drawing/2017/model3d" xmlns:o="urn:schemas-microsoft-com:office:office" xmlns:oel="http://schemas.microsoft.com/office/2019/extlst" xmlns:r="http://schemas.openxmlformats.org/officeDocument/2006/relationships" xmlns:m="http://schemas.openxmlformats.org/officeDocument/2006/math" xmlns:v="urn:schemas-microsoft-com:vml" xmlns:wp14="http://schemas.microsoft.com/office/word/2010/wordprocessingDrawing" xmlns:wp="http://schemas.openxmlformats.org/drawingml/2006/wordprocessingDrawing" xmlns:w10="urn:schemas-microsoft-com:office:word" xmlns:w="http://schemas.openxmlformats.org/wordprocessingml/2006/main" xmlns:w14="http://schemas.microsoft.com/office/word/2010/wordml" xmlns:w15="http://schemas.microsoft.com/office/word/2012/wordml" xmlns:w16cex="http://schemas.microsoft.com/office/word/2018/wordml/cex" xmlns:w16cid="http://schemas.microsoft.com/office/word/2016/wordml/cid" xmlns:w16="http://schemas.microsoft.com/office/word/2018/wordml" xmlns:w16du="http://schemas.microsoft.com/office/word/2023/wordml/word16du" xmlns:w16sdtdh="http://schemas.microsoft.com/office/word/2020/wordml/sdtdatahash" xmlns:w16sdtfl="http://schemas.microsoft.com/office/word/2024/wordml/sdtformatlock" xmlns:w16se="http://schemas.microsoft.com/office/word/2015/wordml/symex" xmlns:wpg="http://schemas.microsoft.com/office/word/2010/wordprocessingGroup" xmlns:wpi="http://schemas.microsoft.com/office/word/2010/wordprocessingInk" xmlns:wne="http://schemas.microsoft.com/office/word/2006/wordml" xmlns:wps="http://schemas.microsoft.com/office/word/2010/wordprocessingShape" mc:Ignorable="w14 w15 w16se w16cid w16 w16cex w16sdtdh w16sdtfl w16du wp14">
+  <w:p>
+    <w:pPr>
+      <w:pStyle w:val="Header"/>
+    </w:pPr>
+  </w:p>
+</w:hdr>
+</file>
+
+<file path=word/header3.xml><?xml version="1.0" encoding="utf-8"?>
+<w:hdr xmlns:wpc="http://schemas.microsoft.com/office/word/2010/wordprocessingCanvas" xmlns:cx="http://schemas.microsoft.com/office/drawing/2014/chartex" xmlns:cx1="http://schemas.microsoft.com/office/drawing/2015/9/8/chartex" xmlns:cx2="http://schemas.microsoft.com/office/drawing/2015/10/21/chartex" xmlns:cx3="http://schemas.microsoft.com/office/drawing/2016/5/9/chartex" xmlns:cx4="http://schemas.microsoft.com/office/drawing/2016/5/10/chartex" xmlns:cx5="http://schemas.microsoft.com/office/drawing/2016/5/11/chartex" xmlns:cx6="http://schemas.microsoft.com/office/drawing/2016/5/12/chartex" xmlns:cx7="http://schemas.microsoft.com/office/drawing/2016/5/13/chartex" xmlns:cx8="http://schemas.microsoft.com/office/drawing/2016/5/14/chartex" xmlns:mc="http://schemas.openxmlformats.org/markup-compatibility/2006" xmlns:aink="http://schemas.microsoft.com/office/drawing/2016/ink" xmlns:am3d="http://schemas.microsoft.com/office/drawing/2017/model3d" xmlns:o="urn:schemas-microsoft-com:office:office" xmlns:oel="http://schemas.microsoft.com/office/2019/extlst" xmlns:r="http://schemas.openxmlformats.org/officeDocument/2006/relationships" xmlns:m="http://schemas.openxmlformats.org/officeDocument/2006/math" xmlns:v="urn:schemas-microsoft-com:vml" xmlns:wp14="http://schemas.microsoft.com/office/word/2010/wordprocessingDrawing" xmlns:wp="http://schemas.openxmlformats.org/drawingml/2006/wordprocessingDrawing" xmlns:w10="urn:schemas-microsoft-com:office:word" xmlns:w="http://schemas.openxmlformats.org/wordprocessingml/2006/main" xmlns:w14="http://schemas.microsoft.com/office/word/2010/wordml" xmlns:w15="http://schemas.microsoft.com/office/word/2012/wordml" xmlns:w16cex="http://schemas.microsoft.com/office/word/2018/wordml/cex" xmlns:w16cid="http://schemas.microsoft.com/office/word/2016/wordml/cid" xmlns:w16="http://schemas.microsoft.com/office/word/2018/wordml" xmlns:w16du="http://schemas.microsoft.com/office/word/2023/wordml/word16du" xmlns:w16sdtdh="http://schemas.microsoft.com/office/word/2020/wordml/sdtdatahash" xmlns:w16sdtfl="http://schemas.microsoft.com/office/word/2024/wordml/sdtformatlock" xmlns:w16se="http://schemas.microsoft.com/office/word/2015/wordml/symex" xmlns:wpg="http://schemas.microsoft.com/office/word/2010/wordprocessingGroup" xmlns:wpi="http://schemas.microsoft.com/office/word/2010/wordprocessingInk" xmlns:wne="http://schemas.microsoft.com/office/word/2006/wordml" xmlns:wps="http://schemas.microsoft.com/office/word/2010/wordprocessingShape" mc:Ignorable="w14 w15 w16se w16cid w16 w16cex w16sdtdh w16sdtfl w16du wp14">
+  <w:p>
+    <w:pPr>
+      <w:pStyle w:val="Header"/>
+    </w:pPr>
+  </w:p>
+</w:hdr>
+</file>
+
 <file path=word/numbering.xml><?xml version="1.0" encoding="utf-8"?>
 <w:numbering xmlns:wpc="http://schemas.microsoft.com/office/word/2010/wordprocessingCanvas" xmlns:cx="http://schemas.microsoft.com/office/drawing/2014/chartex" xmlns:cx1="http://schemas.microsoft.com/office/drawing/2015/9/8/chartex" xmlns:cx2="http://schemas.microsoft.com/office/drawing/2015/10/21/chartex" xmlns:cx3="http://schemas.microsoft.com/office/drawing/2016/5/9/chartex" xmlns:cx4="http://schemas.microsoft.com/office/drawing/2016/5/10/chartex" xmlns:cx5="http://schemas.microsoft.com/office/drawing/2016/5/11/chartex" xmlns:cx6="http://schemas.microsoft.com/office/drawing/2016/5/12/chartex" xmlns:cx7="http://schemas.microsoft.com/office/drawing/2016/5/13/chartex" xmlns:cx8="http://schemas.microsoft.com/office/drawing/2016/5/14/chartex" xmlns:mc="http://schemas.openxmlformats.org/markup-compatibility/2006" xmlns:aink="http://schemas.microsoft.com/office/drawing/2016/ink" xmlns:am3d="http://schemas.microsoft.com/office/drawing/2017/model3d" xmlns:o="urn:schemas-microsoft-com:office:office" xmlns:oel="http://schemas.microsoft.com/office/2019/extlst" xmlns:r="http://schemas.openxmlformats.org/officeDocument/2006/relationships" xmlns:m="http://schemas.openxmlformats.org/officeDocument/2006/math" xmlns:v="urn:schemas-microsoft-com:vml" xmlns:wp14="http://schemas.microsoft.com/office/word/2010/wordprocessingDrawing" xmlns:wp="http://schemas.openxmlformats.org/drawingml/2006/wordprocessingDrawing" xmlns:w10="urn:schemas-microsoft-com:office:word" xmlns:w="http://schemas.openxmlformats.org/wordprocessingml/2006/main" xmlns:w14="http://schemas.microsoft.com/office/word/2010/wordml" xmlns:w15="http://schemas.microsoft.com/office/word/2012/wordml" xmlns:w16cex="http://schemas.microsoft.com/office/word/2018/wordml/cex" xmlns:w16cid="http://schemas.microsoft.com/office/word/2016/wordml/cid" xmlns:w16="http://schemas.microsoft.com/office/word/2018/wordml" xmlns:w16du="http://schemas.microsoft.com/office/word/2023/wordml/word16du" xmlns:w16sdtdh="http://schemas.microsoft.com/office/word/2020/wordml/sdtdatahash" xmlns:w16sdtfl="http://schemas.microsoft.com/office/word/2024/wordml/sdtformatlock" xmlns:w16se="http://schemas.microsoft.com/office/word/2015/wordml/symex" xmlns:wpg="http://schemas.microsoft.com/office/word/2010/wordprocessingGroup" xmlns:wpi="http://schemas.microsoft.com/office/word/2010/wordprocessingInk" xmlns:wne="http://schemas.microsoft.com/office/word/2006/wordml" xmlns:wps="http://schemas.microsoft.com/office/word/2010/wordprocessingShape" mc:Ignorable="w14 w15 w16se w16cid w16 w16cex w16sdtdh w16sdtfl w16du wp14">
   <w:abstractNum w:abstractNumId="0" w15:restartNumberingAfterBreak="0">
@@ -7104,6 +8473,119 @@
     </w:lvl>
   </w:abstractNum>
   <w:abstractNum w:abstractNumId="1" w15:restartNumberingAfterBreak="0">
+    <w:nsid w:val="0D0D62B3"/>
+    <w:multiLevelType w:val="multilevel"/>
+    <w:tmpl w:val="74E87AE4"/>
+    <w:lvl w:ilvl="0">
+      <w:start w:val="1"/>
+      <w:numFmt w:val="decimal"/>
+      <w:lvlText w:val="%1."/>
+      <w:lvlJc w:val="left"/>
+      <w:pPr>
+        <w:tabs>
+          <w:tab w:val="num" w:pos="720"/>
+        </w:tabs>
+        <w:ind w:left="720" w:hanging="360"/>
+      </w:pPr>
+    </w:lvl>
+    <w:lvl w:ilvl="1" w:tentative="1">
+      <w:start w:val="1"/>
+      <w:numFmt w:val="decimal"/>
+      <w:lvlText w:val="%2."/>
+      <w:lvlJc w:val="left"/>
+      <w:pPr>
+        <w:tabs>
+          <w:tab w:val="num" w:pos="1440"/>
+        </w:tabs>
+        <w:ind w:left="1440" w:hanging="360"/>
+      </w:pPr>
+    </w:lvl>
+    <w:lvl w:ilvl="2" w:tentative="1">
+      <w:start w:val="1"/>
+      <w:numFmt w:val="decimal"/>
+      <w:lvlText w:val="%3."/>
+      <w:lvlJc w:val="left"/>
+      <w:pPr>
+        <w:tabs>
+          <w:tab w:val="num" w:pos="2160"/>
+        </w:tabs>
+        <w:ind w:left="2160" w:hanging="360"/>
+      </w:pPr>
+    </w:lvl>
+    <w:lvl w:ilvl="3" w:tentative="1">
+      <w:start w:val="1"/>
+      <w:numFmt w:val="decimal"/>
+      <w:lvlText w:val="%4."/>
+      <w:lvlJc w:val="left"/>
+      <w:pPr>
+        <w:tabs>
+          <w:tab w:val="num" w:pos="2880"/>
+        </w:tabs>
+        <w:ind w:left="2880" w:hanging="360"/>
+      </w:pPr>
+    </w:lvl>
+    <w:lvl w:ilvl="4" w:tentative="1">
+      <w:start w:val="1"/>
+      <w:numFmt w:val="decimal"/>
+      <w:lvlText w:val="%5."/>
+      <w:lvlJc w:val="left"/>
+      <w:pPr>
+        <w:tabs>
+          <w:tab w:val="num" w:pos="3600"/>
+        </w:tabs>
+        <w:ind w:left="3600" w:hanging="360"/>
+      </w:pPr>
+    </w:lvl>
+    <w:lvl w:ilvl="5" w:tentative="1">
+      <w:start w:val="1"/>
+      <w:numFmt w:val="decimal"/>
+      <w:lvlText w:val="%6."/>
+      <w:lvlJc w:val="left"/>
+      <w:pPr>
+        <w:tabs>
+          <w:tab w:val="num" w:pos="4320"/>
+        </w:tabs>
+        <w:ind w:left="4320" w:hanging="360"/>
+      </w:pPr>
+    </w:lvl>
+    <w:lvl w:ilvl="6" w:tentative="1">
+      <w:start w:val="1"/>
+      <w:numFmt w:val="decimal"/>
+      <w:lvlText w:val="%7."/>
+      <w:lvlJc w:val="left"/>
+      <w:pPr>
+        <w:tabs>
+          <w:tab w:val="num" w:pos="5040"/>
+        </w:tabs>
+        <w:ind w:left="5040" w:hanging="360"/>
+      </w:pPr>
+    </w:lvl>
+    <w:lvl w:ilvl="7" w:tentative="1">
+      <w:start w:val="1"/>
+      <w:numFmt w:val="decimal"/>
+      <w:lvlText w:val="%8."/>
+      <w:lvlJc w:val="left"/>
+      <w:pPr>
+        <w:tabs>
+          <w:tab w:val="num" w:pos="5760"/>
+        </w:tabs>
+        <w:ind w:left="5760" w:hanging="360"/>
+      </w:pPr>
+    </w:lvl>
+    <w:lvl w:ilvl="8" w:tentative="1">
+      <w:start w:val="1"/>
+      <w:numFmt w:val="decimal"/>
+      <w:lvlText w:val="%9."/>
+      <w:lvlJc w:val="left"/>
+      <w:pPr>
+        <w:tabs>
+          <w:tab w:val="num" w:pos="6480"/>
+        </w:tabs>
+        <w:ind w:left="6480" w:hanging="360"/>
+      </w:pPr>
+    </w:lvl>
+  </w:abstractNum>
+  <w:abstractNum w:abstractNumId="2" w15:restartNumberingAfterBreak="0">
     <w:nsid w:val="159F379D"/>
     <w:multiLevelType w:val="multilevel"/>
     <w:tmpl w:val="899CB4BA"/>
@@ -7252,7 +8734,7 @@
       </w:rPr>
     </w:lvl>
   </w:abstractNum>
-  <w:abstractNum w:abstractNumId="2" w15:restartNumberingAfterBreak="0">
+  <w:abstractNum w:abstractNumId="3" w15:restartNumberingAfterBreak="0">
     <w:nsid w:val="17042E67"/>
     <w:multiLevelType w:val="multilevel"/>
     <w:tmpl w:val="E6D0552A"/>
@@ -7401,7 +8883,7 @@
       </w:rPr>
     </w:lvl>
   </w:abstractNum>
-  <w:abstractNum w:abstractNumId="3" w15:restartNumberingAfterBreak="0">
+  <w:abstractNum w:abstractNumId="4" w15:restartNumberingAfterBreak="0">
     <w:nsid w:val="1EA008B4"/>
     <w:multiLevelType w:val="multilevel"/>
     <w:tmpl w:val="344499D4"/>
@@ -7550,7 +9032,7 @@
       </w:rPr>
     </w:lvl>
   </w:abstractNum>
-  <w:abstractNum w:abstractNumId="4" w15:restartNumberingAfterBreak="0">
+  <w:abstractNum w:abstractNumId="5" w15:restartNumberingAfterBreak="0">
     <w:nsid w:val="1FCE612E"/>
     <w:multiLevelType w:val="multilevel"/>
     <w:tmpl w:val="C490510E"/>
@@ -7699,7 +9181,7 @@
       </w:rPr>
     </w:lvl>
   </w:abstractNum>
-  <w:abstractNum w:abstractNumId="5" w15:restartNumberingAfterBreak="0">
+  <w:abstractNum w:abstractNumId="6" w15:restartNumberingAfterBreak="0">
     <w:nsid w:val="28C42BE1"/>
     <w:multiLevelType w:val="multilevel"/>
     <w:tmpl w:val="46CC6062"/>
@@ -7848,7 +9330,7 @@
       </w:rPr>
     </w:lvl>
   </w:abstractNum>
-  <w:abstractNum w:abstractNumId="6" w15:restartNumberingAfterBreak="0">
+  <w:abstractNum w:abstractNumId="7" w15:restartNumberingAfterBreak="0">
     <w:nsid w:val="2F406DAF"/>
     <w:multiLevelType w:val="multilevel"/>
     <w:tmpl w:val="2A426EF2"/>
@@ -7997,7 +9479,156 @@
       </w:rPr>
     </w:lvl>
   </w:abstractNum>
-  <w:abstractNum w:abstractNumId="7" w15:restartNumberingAfterBreak="0">
+  <w:abstractNum w:abstractNumId="8" w15:restartNumberingAfterBreak="0">
+    <w:nsid w:val="33464365"/>
+    <w:multiLevelType w:val="multilevel"/>
+    <w:tmpl w:val="9D843CE2"/>
+    <w:lvl w:ilvl="0">
+      <w:start w:val="1"/>
+      <w:numFmt w:val="bullet"/>
+      <w:lvlText w:val=""/>
+      <w:lvlJc w:val="left"/>
+      <w:pPr>
+        <w:tabs>
+          <w:tab w:val="num" w:pos="720"/>
+        </w:tabs>
+        <w:ind w:left="720" w:hanging="360"/>
+      </w:pPr>
+      <w:rPr>
+        <w:rFonts w:ascii="Symbol" w:hAnsi="Symbol" w:hint="default"/>
+        <w:sz w:val="20"/>
+      </w:rPr>
+    </w:lvl>
+    <w:lvl w:ilvl="1" w:tentative="1">
+      <w:start w:val="1"/>
+      <w:numFmt w:val="bullet"/>
+      <w:lvlText w:val="o"/>
+      <w:lvlJc w:val="left"/>
+      <w:pPr>
+        <w:tabs>
+          <w:tab w:val="num" w:pos="1440"/>
+        </w:tabs>
+        <w:ind w:left="1440" w:hanging="360"/>
+      </w:pPr>
+      <w:rPr>
+        <w:rFonts w:ascii="Courier New" w:hAnsi="Courier New" w:hint="default"/>
+        <w:sz w:val="20"/>
+      </w:rPr>
+    </w:lvl>
+    <w:lvl w:ilvl="2" w:tentative="1">
+      <w:start w:val="1"/>
+      <w:numFmt w:val="bullet"/>
+      <w:lvlText w:val=""/>
+      <w:lvlJc w:val="left"/>
+      <w:pPr>
+        <w:tabs>
+          <w:tab w:val="num" w:pos="2160"/>
+        </w:tabs>
+        <w:ind w:left="2160" w:hanging="360"/>
+      </w:pPr>
+      <w:rPr>
+        <w:rFonts w:ascii="Wingdings" w:hAnsi="Wingdings" w:hint="default"/>
+        <w:sz w:val="20"/>
+      </w:rPr>
+    </w:lvl>
+    <w:lvl w:ilvl="3" w:tentative="1">
+      <w:start w:val="1"/>
+      <w:numFmt w:val="bullet"/>
+      <w:lvlText w:val=""/>
+      <w:lvlJc w:val="left"/>
+      <w:pPr>
+        <w:tabs>
+          <w:tab w:val="num" w:pos="2880"/>
+        </w:tabs>
+        <w:ind w:left="2880" w:hanging="360"/>
+      </w:pPr>
+      <w:rPr>
+        <w:rFonts w:ascii="Wingdings" w:hAnsi="Wingdings" w:hint="default"/>
+        <w:sz w:val="20"/>
+      </w:rPr>
+    </w:lvl>
+    <w:lvl w:ilvl="4" w:tentative="1">
+      <w:start w:val="1"/>
+      <w:numFmt w:val="bullet"/>
+      <w:lvlText w:val=""/>
+      <w:lvlJc w:val="left"/>
+      <w:pPr>
+        <w:tabs>
+          <w:tab w:val="num" w:pos="3600"/>
+        </w:tabs>
+        <w:ind w:left="3600" w:hanging="360"/>
+      </w:pPr>
+      <w:rPr>
+        <w:rFonts w:ascii="Wingdings" w:hAnsi="Wingdings" w:hint="default"/>
+        <w:sz w:val="20"/>
+      </w:rPr>
+    </w:lvl>
+    <w:lvl w:ilvl="5" w:tentative="1">
+      <w:start w:val="1"/>
+      <w:numFmt w:val="bullet"/>
+      <w:lvlText w:val=""/>
+      <w:lvlJc w:val="left"/>
+      <w:pPr>
+        <w:tabs>
+          <w:tab w:val="num" w:pos="4320"/>
+        </w:tabs>
+        <w:ind w:left="4320" w:hanging="360"/>
+      </w:pPr>
+      <w:rPr>
+        <w:rFonts w:ascii="Wingdings" w:hAnsi="Wingdings" w:hint="default"/>
+        <w:sz w:val="20"/>
+      </w:rPr>
+    </w:lvl>
+    <w:lvl w:ilvl="6" w:tentative="1">
+      <w:start w:val="1"/>
+      <w:numFmt w:val="bullet"/>
+      <w:lvlText w:val=""/>
+      <w:lvlJc w:val="left"/>
+      <w:pPr>
+        <w:tabs>
+          <w:tab w:val="num" w:pos="5040"/>
+        </w:tabs>
+        <w:ind w:left="5040" w:hanging="360"/>
+      </w:pPr>
+      <w:rPr>
+        <w:rFonts w:ascii="Wingdings" w:hAnsi="Wingdings" w:hint="default"/>
+        <w:sz w:val="20"/>
+      </w:rPr>
+    </w:lvl>
+    <w:lvl w:ilvl="7" w:tentative="1">
+      <w:start w:val="1"/>
+      <w:numFmt w:val="bullet"/>
+      <w:lvlText w:val=""/>
+      <w:lvlJc w:val="left"/>
+      <w:pPr>
+        <w:tabs>
+          <w:tab w:val="num" w:pos="5760"/>
+        </w:tabs>
+        <w:ind w:left="5760" w:hanging="360"/>
+      </w:pPr>
+      <w:rPr>
+        <w:rFonts w:ascii="Wingdings" w:hAnsi="Wingdings" w:hint="default"/>
+        <w:sz w:val="20"/>
+      </w:rPr>
+    </w:lvl>
+    <w:lvl w:ilvl="8" w:tentative="1">
+      <w:start w:val="1"/>
+      <w:numFmt w:val="bullet"/>
+      <w:lvlText w:val=""/>
+      <w:lvlJc w:val="left"/>
+      <w:pPr>
+        <w:tabs>
+          <w:tab w:val="num" w:pos="6480"/>
+        </w:tabs>
+        <w:ind w:left="6480" w:hanging="360"/>
+      </w:pPr>
+      <w:rPr>
+        <w:rFonts w:ascii="Wingdings" w:hAnsi="Wingdings" w:hint="default"/>
+        <w:sz w:val="20"/>
+      </w:rPr>
+    </w:lvl>
+  </w:abstractNum>
+  <w:abstractNum w:abstractNumId="9" w15:restartNumberingAfterBreak="0">
     <w:nsid w:val="46126F4B"/>
     <w:multiLevelType w:val="multilevel"/>
     <w:tmpl w:val="9D845342"/>
@@ -8146,7 +9777,7 @@
       </w:rPr>
     </w:lvl>
   </w:abstractNum>
-  <w:abstractNum w:abstractNumId="8" w15:restartNumberingAfterBreak="0">
+  <w:abstractNum w:abstractNumId="10" w15:restartNumberingAfterBreak="0">
     <w:nsid w:val="52251BB5"/>
     <w:multiLevelType w:val="multilevel"/>
     <w:tmpl w:val="58C02384"/>
@@ -8295,7 +9926,156 @@
       </w:rPr>
     </w:lvl>
   </w:abstractNum>
-  <w:abstractNum w:abstractNumId="9" w15:restartNumberingAfterBreak="0">
+  <w:abstractNum w:abstractNumId="11" w15:restartNumberingAfterBreak="0">
+    <w:nsid w:val="67586EFB"/>
+    <w:multiLevelType w:val="multilevel"/>
+    <w:tmpl w:val="AEAA233E"/>
+    <w:lvl w:ilvl="0">
+      <w:start w:val="1"/>
+      <w:numFmt w:val="bullet"/>
+      <w:lvlText w:val=""/>
+      <w:lvlJc w:val="left"/>
+      <w:pPr>
+        <w:tabs>
+          <w:tab w:val="num" w:pos="720"/>
+        </w:tabs>
+        <w:ind w:left="720" w:hanging="360"/>
+      </w:pPr>
+      <w:rPr>
+        <w:rFonts w:ascii="Symbol" w:hAnsi="Symbol" w:hint="default"/>
+        <w:sz w:val="20"/>
+      </w:rPr>
+    </w:lvl>
+    <w:lvl w:ilvl="1" w:tentative="1">
+      <w:start w:val="1"/>
+      <w:numFmt w:val="bullet"/>
+      <w:lvlText w:val="o"/>
+      <w:lvlJc w:val="left"/>
+      <w:pPr>
+        <w:tabs>
+          <w:tab w:val="num" w:pos="1440"/>
+        </w:tabs>
+        <w:ind w:left="1440" w:hanging="360"/>
+      </w:pPr>
+      <w:rPr>
+        <w:rFonts w:ascii="Courier New" w:hAnsi="Courier New" w:hint="default"/>
+        <w:sz w:val="20"/>
+      </w:rPr>
+    </w:lvl>
+    <w:lvl w:ilvl="2" w:tentative="1">
+      <w:start w:val="1"/>
+      <w:numFmt w:val="bullet"/>
+      <w:lvlText w:val=""/>
+      <w:lvlJc w:val="left"/>
+      <w:pPr>
+        <w:tabs>
+          <w:tab w:val="num" w:pos="2160"/>
+        </w:tabs>
+        <w:ind w:left="2160" w:hanging="360"/>
+      </w:pPr>
+      <w:rPr>
+        <w:rFonts w:ascii="Wingdings" w:hAnsi="Wingdings" w:hint="default"/>
+        <w:sz w:val="20"/>
+      </w:rPr>
+    </w:lvl>
+    <w:lvl w:ilvl="3" w:tentative="1">
+      <w:start w:val="1"/>
+      <w:numFmt w:val="bullet"/>
+      <w:lvlText w:val=""/>
+      <w:lvlJc w:val="left"/>
+      <w:pPr>
+        <w:tabs>
+          <w:tab w:val="num" w:pos="2880"/>
+        </w:tabs>
+        <w:ind w:left="2880" w:hanging="360"/>
+      </w:pPr>
+      <w:rPr>
+        <w:rFonts w:ascii="Wingdings" w:hAnsi="Wingdings" w:hint="default"/>
+        <w:sz w:val="20"/>
+      </w:rPr>
+    </w:lvl>
+    <w:lvl w:ilvl="4" w:tentative="1">
+      <w:start w:val="1"/>
+      <w:numFmt w:val="bullet"/>
+      <w:lvlText w:val=""/>
+      <w:lvlJc w:val="left"/>
+      <w:pPr>
+        <w:tabs>
+          <w:tab w:val="num" w:pos="3600"/>
+        </w:tabs>
+        <w:ind w:left="3600" w:hanging="360"/>
+      </w:pPr>
+      <w:rPr>
+        <w:rFonts w:ascii="Wingdings" w:hAnsi="Wingdings" w:hint="default"/>
+        <w:sz w:val="20"/>
+      </w:rPr>
+    </w:lvl>
+    <w:lvl w:ilvl="5" w:tentative="1">
+      <w:start w:val="1"/>
+      <w:numFmt w:val="bullet"/>
+      <w:lvlText w:val=""/>
+      <w:lvlJc w:val="left"/>
+      <w:pPr>
+        <w:tabs>
+          <w:tab w:val="num" w:pos="4320"/>
+        </w:tabs>
+        <w:ind w:left="4320" w:hanging="360"/>
+      </w:pPr>
+      <w:rPr>
+        <w:rFonts w:ascii="Wingdings" w:hAnsi="Wingdings" w:hint="default"/>
+        <w:sz w:val="20"/>
+      </w:rPr>
+    </w:lvl>
+    <w:lvl w:ilvl="6" w:tentative="1">
+      <w:start w:val="1"/>
+      <w:numFmt w:val="bullet"/>
+      <w:lvlText w:val=""/>
+      <w:lvlJc w:val="left"/>
+      <w:pPr>
+        <w:tabs>
+          <w:tab w:val="num" w:pos="5040"/>
+        </w:tabs>
+        <w:ind w:left="5040" w:hanging="360"/>
+      </w:pPr>
+      <w:rPr>
+        <w:rFonts w:ascii="Wingdings" w:hAnsi="Wingdings" w:hint="default"/>
+        <w:sz w:val="20"/>
+      </w:rPr>
+    </w:lvl>
+    <w:lvl w:ilvl="7" w:tentative="1">
+      <w:start w:val="1"/>
+      <w:numFmt w:val="bullet"/>
+      <w:lvlText w:val=""/>
+      <w:lvlJc w:val="left"/>
+      <w:pPr>
+        <w:tabs>
+          <w:tab w:val="num" w:pos="5760"/>
+        </w:tabs>
+        <w:ind w:left="5760" w:hanging="360"/>
+      </w:pPr>
+      <w:rPr>
+        <w:rFonts w:ascii="Wingdings" w:hAnsi="Wingdings" w:hint="default"/>
+        <w:sz w:val="20"/>
+      </w:rPr>
+    </w:lvl>
+    <w:lvl w:ilvl="8" w:tentative="1">
+      <w:start w:val="1"/>
+      <w:numFmt w:val="bullet"/>
+      <w:lvlText w:val=""/>
+      <w:lvlJc w:val="left"/>
+      <w:pPr>
+        <w:tabs>
+          <w:tab w:val="num" w:pos="6480"/>
+        </w:tabs>
+        <w:ind w:left="6480" w:hanging="360"/>
+      </w:pPr>
+      <w:rPr>
+        <w:rFonts w:ascii="Wingdings" w:hAnsi="Wingdings" w:hint="default"/>
+        <w:sz w:val="20"/>
+      </w:rPr>
+    </w:lvl>
+  </w:abstractNum>
+  <w:abstractNum w:abstractNumId="12" w15:restartNumberingAfterBreak="0">
     <w:nsid w:val="6A660BF8"/>
     <w:multiLevelType w:val="multilevel"/>
     <w:tmpl w:val="B094B470"/>
@@ -8444,7 +10224,7 @@
       </w:rPr>
     </w:lvl>
   </w:abstractNum>
-  <w:abstractNum w:abstractNumId="10" w15:restartNumberingAfterBreak="0">
+  <w:abstractNum w:abstractNumId="13" w15:restartNumberingAfterBreak="0">
     <w:nsid w:val="6BC52921"/>
     <w:multiLevelType w:val="multilevel"/>
     <w:tmpl w:val="FFC018B4"/>
@@ -8593,7 +10373,7 @@
       </w:rPr>
     </w:lvl>
   </w:abstractNum>
-  <w:abstractNum w:abstractNumId="11" w15:restartNumberingAfterBreak="0">
+  <w:abstractNum w:abstractNumId="14" w15:restartNumberingAfterBreak="0">
     <w:nsid w:val="72740FDC"/>
     <w:multiLevelType w:val="multilevel"/>
     <w:tmpl w:val="577828EC"/>
@@ -8742,40 +10522,201 @@
       </w:rPr>
     </w:lvl>
   </w:abstractNum>
+  <w:abstractNum w:abstractNumId="15" w15:restartNumberingAfterBreak="0">
+    <w:nsid w:val="73456C7C"/>
+    <w:multiLevelType w:val="multilevel"/>
+    <w:tmpl w:val="641E6912"/>
+    <w:lvl w:ilvl="0">
+      <w:start w:val="1"/>
+      <w:numFmt w:val="bullet"/>
+      <w:lvlText w:val=""/>
+      <w:lvlJc w:val="left"/>
+      <w:pPr>
+        <w:tabs>
+          <w:tab w:val="num" w:pos="720"/>
+        </w:tabs>
+        <w:ind w:left="720" w:hanging="360"/>
+      </w:pPr>
+      <w:rPr>
+        <w:rFonts w:ascii="Symbol" w:hAnsi="Symbol" w:hint="default"/>
+        <w:sz w:val="20"/>
+      </w:rPr>
+    </w:lvl>
+    <w:lvl w:ilvl="1" w:tentative="1">
+      <w:start w:val="1"/>
+      <w:numFmt w:val="bullet"/>
+      <w:lvlText w:val="o"/>
+      <w:lvlJc w:val="left"/>
+      <w:pPr>
+        <w:tabs>
+          <w:tab w:val="num" w:pos="1440"/>
+        </w:tabs>
+        <w:ind w:left="1440" w:hanging="360"/>
+      </w:pPr>
+      <w:rPr>
+        <w:rFonts w:ascii="Courier New" w:hAnsi="Courier New" w:hint="default"/>
+        <w:sz w:val="20"/>
+      </w:rPr>
+    </w:lvl>
+    <w:lvl w:ilvl="2" w:tentative="1">
+      <w:start w:val="1"/>
+      <w:numFmt w:val="bullet"/>
+      <w:lvlText w:val=""/>
+      <w:lvlJc w:val="left"/>
+      <w:pPr>
+        <w:tabs>
+          <w:tab w:val="num" w:pos="2160"/>
+        </w:tabs>
+        <w:ind w:left="2160" w:hanging="360"/>
+      </w:pPr>
+      <w:rPr>
+        <w:rFonts w:ascii="Wingdings" w:hAnsi="Wingdings" w:hint="default"/>
+        <w:sz w:val="20"/>
+      </w:rPr>
+    </w:lvl>
+    <w:lvl w:ilvl="3" w:tentative="1">
+      <w:start w:val="1"/>
+      <w:numFmt w:val="bullet"/>
+      <w:lvlText w:val=""/>
+      <w:lvlJc w:val="left"/>
+      <w:pPr>
+        <w:tabs>
+          <w:tab w:val="num" w:pos="2880"/>
+        </w:tabs>
+        <w:ind w:left="2880" w:hanging="360"/>
+      </w:pPr>
+      <w:rPr>
+        <w:rFonts w:ascii="Wingdings" w:hAnsi="Wingdings" w:hint="default"/>
+        <w:sz w:val="20"/>
+      </w:rPr>
+    </w:lvl>
+    <w:lvl w:ilvl="4" w:tentative="1">
+      <w:start w:val="1"/>
+      <w:numFmt w:val="bullet"/>
+      <w:lvlText w:val=""/>
+      <w:lvlJc w:val="left"/>
+      <w:pPr>
+        <w:tabs>
+          <w:tab w:val="num" w:pos="3600"/>
+        </w:tabs>
+        <w:ind w:left="3600" w:hanging="360"/>
+      </w:pPr>
+      <w:rPr>
+        <w:rFonts w:ascii="Wingdings" w:hAnsi="Wingdings" w:hint="default"/>
+        <w:sz w:val="20"/>
+      </w:rPr>
+    </w:lvl>
+    <w:lvl w:ilvl="5" w:tentative="1">
+      <w:start w:val="1"/>
+      <w:numFmt w:val="bullet"/>
+      <w:lvlText w:val=""/>
+      <w:lvlJc w:val="left"/>
+      <w:pPr>
+        <w:tabs>
+          <w:tab w:val="num" w:pos="4320"/>
+        </w:tabs>
+        <w:ind w:left="4320" w:hanging="360"/>
+      </w:pPr>
+      <w:rPr>
+        <w:rFonts w:ascii="Wingdings" w:hAnsi="Wingdings" w:hint="default"/>
+        <w:sz w:val="20"/>
+      </w:rPr>
+    </w:lvl>
+    <w:lvl w:ilvl="6" w:tentative="1">
+      <w:start w:val="1"/>
+      <w:numFmt w:val="bullet"/>
+      <w:lvlText w:val=""/>
+      <w:lvlJc w:val="left"/>
+      <w:pPr>
+        <w:tabs>
+          <w:tab w:val="num" w:pos="5040"/>
+        </w:tabs>
+        <w:ind w:left="5040" w:hanging="360"/>
+      </w:pPr>
+      <w:rPr>
+        <w:rFonts w:ascii="Wingdings" w:hAnsi="Wingdings" w:hint="default"/>
+        <w:sz w:val="20"/>
+      </w:rPr>
+    </w:lvl>
+    <w:lvl w:ilvl="7" w:tentative="1">
+      <w:start w:val="1"/>
+      <w:numFmt w:val="bullet"/>
+      <w:lvlText w:val=""/>
+      <w:lvlJc w:val="left"/>
+      <w:pPr>
+        <w:tabs>
+          <w:tab w:val="num" w:pos="5760"/>
+        </w:tabs>
+        <w:ind w:left="5760" w:hanging="360"/>
+      </w:pPr>
+      <w:rPr>
+        <w:rFonts w:ascii="Wingdings" w:hAnsi="Wingdings" w:hint="default"/>
+        <w:sz w:val="20"/>
+      </w:rPr>
+    </w:lvl>
+    <w:lvl w:ilvl="8" w:tentative="1">
+      <w:start w:val="1"/>
+      <w:numFmt w:val="bullet"/>
+      <w:lvlText w:val=""/>
+      <w:lvlJc w:val="left"/>
+      <w:pPr>
+        <w:tabs>
+          <w:tab w:val="num" w:pos="6480"/>
+        </w:tabs>
+        <w:ind w:left="6480" w:hanging="360"/>
+      </w:pPr>
+      <w:rPr>
+        <w:rFonts w:ascii="Wingdings" w:hAnsi="Wingdings" w:hint="default"/>
+        <w:sz w:val="20"/>
+      </w:rPr>
+    </w:lvl>
+  </w:abstractNum>
   <w:num w:numId="1" w16cid:durableId="1310478698">
-    <w:abstractNumId w:val="7"/>
+    <w:abstractNumId w:val="9"/>
   </w:num>
   <w:num w:numId="2" w16cid:durableId="998532069">
     <w:abstractNumId w:val="0"/>
   </w:num>
   <w:num w:numId="3" w16cid:durableId="1546021278">
+    <w:abstractNumId w:val="2"/>
+  </w:num>
+  <w:num w:numId="4" w16cid:durableId="1308240719">
+    <w:abstractNumId w:val="7"/>
+  </w:num>
+  <w:num w:numId="5" w16cid:durableId="118957180">
+    <w:abstractNumId w:val="5"/>
+  </w:num>
+  <w:num w:numId="6" w16cid:durableId="1621909881">
+    <w:abstractNumId w:val="12"/>
+  </w:num>
+  <w:num w:numId="7" w16cid:durableId="55587859">
+    <w:abstractNumId w:val="4"/>
+  </w:num>
+  <w:num w:numId="8" w16cid:durableId="210314773">
+    <w:abstractNumId w:val="13"/>
+  </w:num>
+  <w:num w:numId="9" w16cid:durableId="169688527">
+    <w:abstractNumId w:val="6"/>
+  </w:num>
+  <w:num w:numId="10" w16cid:durableId="774982604">
+    <w:abstractNumId w:val="14"/>
+  </w:num>
+  <w:num w:numId="11" w16cid:durableId="1533374838">
+    <w:abstractNumId w:val="3"/>
+  </w:num>
+  <w:num w:numId="12" w16cid:durableId="1748502676">
+    <w:abstractNumId w:val="10"/>
+  </w:num>
+  <w:num w:numId="13" w16cid:durableId="1965040985">
     <w:abstractNumId w:val="1"/>
   </w:num>
-  <w:num w:numId="4" w16cid:durableId="1308240719">
-    <w:abstractNumId w:val="6"/>
+  <w:num w:numId="14" w16cid:durableId="999844640">
+    <w:abstractNumId w:val="15"/>
   </w:num>
-  <w:num w:numId="5" w16cid:durableId="118957180">
-    <w:abstractNumId w:val="4"/>
-  </w:num>
-  <w:num w:numId="6" w16cid:durableId="1621909881">
-    <w:abstractNumId w:val="9"/>
-  </w:num>
-  <w:num w:numId="7" w16cid:durableId="55587859">
-    <w:abstractNumId w:val="3"/>
-  </w:num>
-  <w:num w:numId="8" w16cid:durableId="210314773">
-    <w:abstractNumId w:val="10"/>
-  </w:num>
-  <w:num w:numId="9" w16cid:durableId="169688527">
-    <w:abstractNumId w:val="5"/>
-  </w:num>
-  <w:num w:numId="10" w16cid:durableId="774982604">
+  <w:num w:numId="15" w16cid:durableId="570122978">
     <w:abstractNumId w:val="11"/>
   </w:num>
-  <w:num w:numId="11" w16cid:durableId="1533374838">
-    <w:abstractNumId w:val="2"/>
-  </w:num>
-  <w:num w:numId="12" w16cid:durableId="1748502676">
+  <w:num w:numId="16" w16cid:durableId="405422809">
     <w:abstractNumId w:val="8"/>
   </w:num>
 </w:numbering>
@@ -9697,6 +11638,50 @@
       <w:spacing w:val="5"/>
     </w:rPr>
   </w:style>
+  <w:style w:type="paragraph" w:styleId="Header">
+    <w:name w:val="header"/>
+    <w:basedOn w:val="Normal"/>
+    <w:link w:val="HeaderChar"/>
+    <w:uiPriority w:val="99"/>
+    <w:unhideWhenUsed/>
+    <w:rsid w:val="00F62359"/>
+    <w:pPr>
+      <w:tabs>
+        <w:tab w:val="center" w:pos="4513"/>
+        <w:tab w:val="right" w:pos="9026"/>
+      </w:tabs>
+      <w:spacing w:after="0" w:line="240" w:lineRule="auto"/>
+    </w:pPr>
+  </w:style>
+  <w:style w:type="character" w:customStyle="1" w:styleId="HeaderChar">
+    <w:name w:val="Header Char"/>
+    <w:basedOn w:val="DefaultParagraphFont"/>
+    <w:link w:val="Header"/>
+    <w:uiPriority w:val="99"/>
+    <w:rsid w:val="00F62359"/>
+  </w:style>
+  <w:style w:type="paragraph" w:styleId="Footer">
+    <w:name w:val="footer"/>
+    <w:basedOn w:val="Normal"/>
+    <w:link w:val="FooterChar"/>
+    <w:uiPriority w:val="99"/>
+    <w:unhideWhenUsed/>
+    <w:rsid w:val="00F62359"/>
+    <w:pPr>
+      <w:tabs>
+        <w:tab w:val="center" w:pos="4513"/>
+        <w:tab w:val="right" w:pos="9026"/>
+      </w:tabs>
+      <w:spacing w:after="0" w:line="240" w:lineRule="auto"/>
+    </w:pPr>
+  </w:style>
+  <w:style w:type="character" w:customStyle="1" w:styleId="FooterChar">
+    <w:name w:val="Footer Char"/>
+    <w:basedOn w:val="DefaultParagraphFont"/>
+    <w:link w:val="Footer"/>
+    <w:uiPriority w:val="99"/>
+    <w:rsid w:val="00F62359"/>
+  </w:style>
 </w:styles>
 </file>
 

</xml_diff>